<commit_message>
Add abandonment-literature passage to 1.1: Phillips & Zhao 1993, Lazar et al. 2015, Peek et al. 2014
Bridges the empty-station narrative to three decades of documented health-technology abandonment, with Lazar's self-concept finding flagged as a foreshadow of the thesis mechanism. All three citations web-verified.

Co-Authored-By: Claude Fable 5 <noreply@anthropic.com>
Claude-Session: https://claude.ai/code/session_01KoT3i8geZspYBMBMKVYJUTG
</commit_message>
<xml_diff>
--- a/docs/thesis/Full_version_V37_REVIEW_EngD_Thesis_Submission_Draft.docx
+++ b/docs/thesis/Full_version_V37_REVIEW_EngD_Thesis_Submission_Draft.docx
@@ -7359,6 +7359,11 @@
           <w:sz w:val="24"/>
         </w:rPr>
         <w:t>The pattern was not new. Facility records showed that FRA had been the lowest-utilised system in the hall for ten consecutive years. New touchscreen interfaces had been installed in 2017. Bilingual on-screen instructions had been added in 2019. The nursing team had been briefed on FRA benefits in 2021. Each campaign had produced a brief rise in use, followed by a return to baseline within four to eight weeks. By June 2024, the cumulative campaign effort had not changed the basic shape of the curve. The clinical lead at the facility believed the residual problem was access or instruction. The author, on early site visits, formed a different impression. Residents were not drifting away from the device. They appeared to be actively avoiding it.</w:t>
+      </w:r>
+    </w:p>
+    <w:p>
+      <w:r>
+        <w:t>Nor is the empty station unique to this hall. The quiet isolation of health technology that users experience as too demanding is documented across three decades of literature: in the classic study of assistive devices, 29.3% were completely abandoned, with devices procured without regard to the user's opinion and poor perceived performance among the strongest predictors (Phillips &amp; Zhao, 1993); in the consumer era, users abandoned some 80% of smart health devices, citing burdensome upkeep, data they could not use — and, notably, devices that did not fit their conception of themselves, a foreshadowing of the mechanism this thesis will pursue (Lazar et al., 2015); and for older adults specifically, the systematic acceptance literature places perceived complexity and usability concerns among the recurring barriers to technology for ageing in place (Peek et al., 2014). What the literature records as rates and factors, the rehabilitation hall displayed as furniture: a validated device, present and switched on, around which daily life had simply learned to flow.</w:t>
       </w:r>
     </w:p>
     <w:p>
@@ -25628,6 +25633,12 @@
       </w:r>
     </w:p>
     <w:p>
+      <w:pPr/>
+      <w:r>
+        <w:t>Lazar, A., Koehler, C., Tanenbaum, J., &amp; Nguyen, D. H. (2015). Why we use and abandon smart devices. In Proceedings of the 2015 ACM International Joint Conference on Pervasive and Ubiquitous Computing (UbiComp '15) (pp. 635-646). ACM. https://doi.org/10.1145/2750858.2804288</w:t>
+      </w:r>
+    </w:p>
+    <w:p>
       <w:pPr>
         <w:pStyle w:val="Normal"/>
         <w:ind w:left="720" w:hanging="720"/>
@@ -25771,7 +25782,19 @@
     <w:p>
       <w:pPr/>
       <w:r>
+        <w:t>Peek, S. T. M., Wouters, E. J. M., van Hoof, J., Luijkx, K. G., Boeije, H. R., &amp; Vrijhoef, H. J. M. (2014). Factors influencing acceptance of technology for aging in place: A systematic review. International Journal of Medical Informatics, 83(4), 235-248. https://doi.org/10.1016/j.ijmedinf.2014.01.004</w:t>
+      </w:r>
+    </w:p>
+    <w:p>
+      <w:pPr/>
+      <w:r>
         <w:t>Perissinotto, C., Zhang, C., Oseau, T., Balik, D., Sou, C., Burnight, C., &amp; Burnight, K. (2019). Feasibility of a tablet designed for older adults to facilitate telemedicine visits [Conference abstract]. Innovation in Aging, 3(Suppl. 1), S975. https://doi.org/10.1093/geroni/igz038.3534</w:t>
+      </w:r>
+    </w:p>
+    <w:p>
+      <w:pPr/>
+      <w:r>
+        <w:t>Phillips, B., &amp; Zhao, H. (1993). Predictors of assistive technology abandonment. Assistive Technology, 5(1), 36-45. https://doi.org/10.1080/10400435.1993.10132205</w:t>
       </w:r>
     </w:p>
     <w:p>

</xml_diff>

<commit_message>
Signpost 1.13 as retrospective: forward references for the commitment gap and adaptive learning
Review finding: the non-claims section read as chronology violation. Added the speaks-from-the-end framing sentence and Chapter 6/7/8.8 forward references so previewed results read as roadmap.

Co-Authored-By: Claude Fable 5 <noreply@anthropic.com>
Claude-Session: https://claude.ai/code/session_01KoT3i8geZspYBMMKVYJUTG
</commit_message>
<xml_diff>
--- a/docs/thesis/Full_version_V37_REVIEW_EngD_Thesis_Submission_Draft.docx
+++ b/docs/thesis/Full_version_V37_REVIEW_EngD_Thesis_Submission_Draft.docx
@@ -7912,7 +7912,7 @@
         <w:jc w:val="both"/>
       </w:pPr>
       <w:r>
-        <w:t>The empirical claims are restricted to the cohorts and observation windows studied. Stage 2 involved a Southern Chinese residential-facility cohort; Stage 3 involved a Hong Kong network-recruited cohort playing remotely on their own computers. Both were Chinese-cultural in language and cultural context, and cross-cultural generalisation is not asserted. The FRA system is an established commercial assessment platform, but this thesis does not validate its diagnostic accuracy, clinical effectiveness or the clinical significance of short-term score changes. It evaluates engagement behaviour and the engineering design of the user interaction. FIAS is not claimed to explain all non-adoption or abandonment of health technology, and "syndrome" is used as a conceptual, non-diagnostic term. Cross-domain application to glucose monitoring, sleep tracking, cognitive screening and other systems remains a design hypothesis.</w:t>
+        <w:t>This section speaks from the end of the journey: like the rest of Chapter 1 it was written with the completed programme in view, and it states in advance the boundaries of claims that the later chapters develop, with forward references marking where each is established. The empirical claims are restricted to the cohorts and observation windows studied. Stage 2 involved a Southern Chinese residential-facility cohort; Stage 3 involved a Hong Kong network-recruited cohort playing remotely on their own computers. Both were Chinese-cultural in language and cultural context, and cross-cultural generalisation is not asserted. The FRA system is an established commercial assessment platform, but this thesis does not validate its diagnostic accuracy, clinical effectiveness or the clinical significance of short-term score changes. It evaluates engagement behaviour and the engineering design of the user interaction. FIAS is not claimed to explain all non-adoption or abandonment of health technology, and "syndrome" is used as a conceptual, non-diagnostic term. Cross-domain application to glucose monitoring, sleep tracking, cognitive screening and other systems remains a design hypothesis.</w:t>
       </w:r>
     </w:p>
     <w:p>
@@ -7920,7 +7920,7 @@
         <w:jc w:val="both"/>
       </w:pPr>
       <w:r>
-        <w:t>The thesis does not claim that adaptive learning is the only design lever capable of reducing failure-associated non-return. Adaptive learning is proposed because trajectory framing, mastery-oriented feedback and calibrated challenge are theoretically suited to changing how failure is interpreted. The 29.3-percentage-point commitment gap does not identify adaptive learning as its sole cause; fatigue, physical capacity, access, session burden and other motivational factors remain viable alternatives. Direct comparison of design levers and controlled evaluation of the complete adaptive-learning framework are therefore required.</w:t>
+        <w:t>The thesis will not claim that adaptive learning is the only design lever capable of reducing failure-associated non-return. Adaptive learning is proposed — in the framework Chapter 7 develops — because trajectory framing, mastery-oriented feedback and calibrated challenge are theoretically suited to changing how failure is interpreted. The 29.3-percentage-point commitment gap that Chapter 6 will report does not identify adaptive learning as its sole cause; fatigue, physical capacity, access, session burden and other motivational factors remain viable alternatives. Direct comparison of design levers and controlled evaluation of the complete adaptive-learning framework are therefore required, and are specified as the confirmatory programme of §8.8.</w:t>
       </w:r>
     </w:p>
     <w:p>

</xml_diff>

<commit_message>
Apply author's writing-logic standard across Chapter 1: no later-obtained results stated early
Ten rewrites converting Stage 1-3 outcome statements into design+question form with reported-in-Chapter pointers; 1.13 rewritten data-free in conditional voice; 1.7 heading renamed; leak scan clean. Standard logged as A0 standing rule; forward-results scan of Ch1-3 added to the final sweep.

Co-Authored-By: Claude Fable 5 <noreply@anthropic.com>
Claude-Session: https://claude.ai/code/session_01KoT3i8geZspYBMMKVYJUTG
</commit_message>
<xml_diff>
--- a/docs/thesis/Full_version_V37_REVIEW_EngD_Thesis_Submission_Draft.docx
+++ b/docs/thesis/Full_version_V37_REVIEW_EngD_Thesis_Submission_Draft.docx
@@ -7636,7 +7636,7 @@
           <w:rFonts w:ascii="Times New Roman" w:hAnsi="Times New Roman" w:eastAsia="Times New Roman" w:cs="Times New Roman"/>
           <w:sz w:val="24"/>
         </w:rPr>
-        <w:t>The six-item instrument reproduced in Appendix A measured awareness, prior use, whether the first result was understood and accepted, subsequent return, discomfort or discouragement, and willingness to use a friendlier version. The headline records indicated that 39% had used FRA; among prior users, approximately 74% were coded as having an adverse, unacceptable or unsuccessful first experience and approximately 82% reported no subsequent return. Working tables from the survey period also suggested favourable physical-access and perceived-benefit estimates; because those figures cannot be traced to items in the archived six-item instrument (Appendix A), they are not reported as survey results in this thesis. The survey therefore provides a strong descriptive problem signature, but its wording does not allow every negative first experience to be treated unambiguously as task failure.</w:t>
+        <w:t>The six-item instrument reproduced in Appendix A measured awareness, prior use, whether the first result was understood and accepted, subsequent return, discomfort or discouragement, and willingness to use a friendlier version. The archived headline records from this survey provide the programme's descriptive problem signature; they are reported and analysed in Chapter 4. Working tables from the survey period also suggested favourable physical-access and perceived-benefit estimates; because those figures cannot be traced to items in the archived six-item instrument (Appendix A), they are not reported as survey results in this thesis. The survey's wording does not allow every negative first experience to be treated unambiguously as task failure — a limitation carried into the design of Stage 2.</w:t>
       </w:r>
     </w:p>
     <w:p>
@@ -7651,7 +7651,7 @@
           <w:rFonts w:ascii="Times New Roman" w:hAnsi="Times New Roman" w:eastAsia="Times New Roman" w:cs="Times New Roman"/>
           <w:sz w:val="24"/>
         </w:rPr>
-        <w:t>The Stage-1 pattern suggested that awareness and favourable beliefs alone were insufficient to explain use and that the first experience deserved direct prospective investigation. Stage 1 did not establish the timing of a psychological collapse, irreversible abandonment, or the mechanism of non-return. It supported the transition from a general dropout hypothesis toward a more specific abandonment construct and generated the questions tested in Stage 2. The FIDS-to-FIAS terminological revision therefore emerged from the Stage-1 interpretation and was strengthened, but not fully validated, by the Stage-2 prospective evidence.</w:t>
+        <w:t>What the survey could establish, and what it could not, defined the next step. A retrospective instrument cannot establish the timing of a psychological collapse, irreversible abandonment, or the mechanism of non-return; whatever pattern it recorded would require direct prospective investigation. Stage 1's role in the architecture was therefore to test whether residents' reports were consistent with the FIDS conjecture and to generate the questions Stage 2 would examine prospectively; the FIDS-to-FIAS terminological revision described in Chapter 4 emerged from that interpretation.</w:t>
       </w:r>
     </w:p>
     <w:p>
@@ -7667,7 +7667,7 @@
           <w:sz w:val="28"/>
           <w:szCs w:val="26"/>
         </w:rPr>
-        <w:t>1.7 The Three F4 Residents and the Objective-Score-Improvement/Non-Return Paradox</w:t>
+        <w:t>1.7 Stage Two and the Score-Improvement/Non-Return Question</w:t>
       </w:r>
     </w:p>
     <w:p>
@@ -7675,7 +7675,7 @@
         <w:jc w:val="both"/>
       </w:pPr>
       <w:r>
-        <w:t>Stage 2 brought the FIDS-to-FIAS distinction into sharper empirical focus. Thirty residents participated over eight weeks in an action-research deployment of a dual-purpose AI-assisted skiing game on the InBody pressure panel. Six residents formed the F4 cluster, defined by the study's provisional coding scheme and complete exit after a single session. Three of the six recorded positive change in the FRA index during that session and did not return during the observation period. The result is important because the behavioural outcome did not track the direction of the recorded score change. It should not, however, be interpreted automatically as evidence of clinical benefit: a single-session change may include measurement variation, familiarisation, practice effects or short-term motor adaptation unless it exceeds a validated measurement-error or clinical-significance threshold.</w:t>
+        <w:t>Stage 2 was designed to bring the FIDS-to-FIAS distinction into sharper empirical focus. Thirty residents participated over eight weeks in an action-research deployment of a dual-purpose AI-assisted skiing game on the InBody pressure panel. The design attended closely to the relationship between recorded score change and subsequent return: if behaviour were to track the direction of recorded change, acceptance models would suffice; if not, something else would be at work. A methodological guard was set in advance: a single-session change may include measurement variation, familiarisation, practice effects or short-term motor adaptation, and is not interpreted as clinical benefit unless it exceeds a validated measurement-error or clinical-significance threshold. The session-level records, the F4 cluster and the behavioural outcomes are reported in Chapter 5.</w:t>
       </w:r>
     </w:p>
     <w:p>
@@ -7683,7 +7683,7 @@
         <w:jc w:val="both"/>
       </w:pPr>
       <w:r>
-        <w:t>The improvers and non-improvers behaved similarly on the outcome of interest: neither group returned during the study window. This objective-score-improvement/non-return paradox became an empirical anchor because conventional acceptance models do not explicitly represent a case in which favourable task-related feedback coexists with non-return after an adverse experience. Behavioural economics was therefore introduced as a candidate explanatory layer. The Stage-2 finding motivated the FIAS interpretation and widened the theoretical frame, but it did not directly measure mental accounting, identity protection, endowment or stereotype threat.</w:t>
+        <w:t>The possibility that improvers and non-improvers might behave alike on the outcome of interest — that favourable task-related feedback might coexist with non-return — is precisely the case conventional acceptance models do not explicitly represent. Behavioural economics was therefore prepared as a candidate explanatory layer for whatever Stage 2 observed, while recognising that the deployment would not directly measure mental accounting, identity protection, endowment or stereotype threat. Whether the score-improvement/non-return paradox materialised, and what it came to anchor, is the subject of Chapter 5.</w:t>
       </w:r>
     </w:p>
     <w:p>
@@ -7710,7 +7710,7 @@
         <w:jc w:val="both"/>
       </w:pPr>
       <w:r>
-        <w:t>Each stage examined the learn-to-earn philosophy from a different angle. Stage 1 suggested that favourable expectations did not guarantee continued engagement after an adverse first experience. Stage 2 embedded coins, level progression and adaptive difficulty in the skiing game, but a subset of participants still did not return under the coupled clinical-game condition. This pattern is consistent with, but does not by itself prove, the interpretation that the surrounding clinical frame can dominate the in-game learning frame. Stage 3 implemented participant-facing decoupling in a separate Hong Kong cohort. Post-failure return increased from 0 of 21 observed Stage-2 dropouts to 10 of 16 initial dropouts in the Stage-3 65-80 group, and to 15 of 23 across Stage 3. Because the cohorts and contexts differed, the change should be interpreted as convergent quasi-experimental evidence rather than as a within-cohort causal effect.</w:t>
+        <w:t>Each stage examined the learn-to-earn philosophy from a different angle: Stage 1 asked whether favourable expectations alone could sustain engagement past an adverse first experience; Stage 2 embedded coins, level progression and adaptive difficulty in the skiing game under the coupled clinical condition; and Stage 3 implemented participant-facing decoupling in a separate Hong Kong cohort, so that the philosophy could be observed with and without the clinical attachment. Because the Stage-2 and Stage-3 cohorts and contexts differ, any between-stage change is interpreted as convergent quasi-experimental evidence rather than a within-cohort causal effect; the stage-by-stage outcomes are reported in Chapters 4 to 6.</w:t>
       </w:r>
     </w:p>
     <w:p>
@@ -7736,7 +7736,7 @@
         <w:jc w:val="both"/>
       </w:pPr>
       <w:r>
-        <w:t>Stage 3 was the programme's attribution experiment. By the close of Stage 2, H0 stood rejected, FIAS had been specified as a provisional construct and a behavioural-economic mechanism had been proposed — but the rejection admitted two readings: either gamification simply does not transfer to frail older adults, or the theory works and the coupling to the clinical technology broke it. These make opposite predictions for the same game with the clinical attachment removed, and Stage 3 was designed to tell them apart — in effect, a positive control for gamification theory itself. A separate-cohort decoupling study could provide strong directional evidence, though not eliminate all cohort and contextual alternatives.</w:t>
+        <w:t>Stage 3 was designed as the programme's attribution experiment. If Stage 2's prospective test were to move H0, the movement would admit two readings: either gamification simply does not transfer to frail older adults, or the theory works and the coupling to the clinical technology breaks it. These make opposite predictions for the same game with the clinical attachment removed, and Stage 3 was designed to tell them apart — in effect, a positive control for gamification theory itself. A separate-cohort decoupling study could provide strong directional evidence, though not eliminate all cohort and contextual alternatives.</w:t>
       </w:r>
     </w:p>
     <w:p>
@@ -7744,7 +7744,7 @@
         <w:jc w:val="both"/>
       </w:pPr>
       <w:r>
-        <w:t>One hundred and twenty adults aged 25-80 were recruited through the author's Hong Kong-based networks — family and personal contacts, work contacts, a charity community network, university support channels and working peers in medical centres. Stage 3 was a remote deployment: the game was ported to an HTML build and distributed by e-mail, and participants played on their own computers, using a trackpad or arrow keys, or a foot-pad sensor where one was available. The skiing mechanic, session structure and five-attempt rule were retained in the ported build; the pressure-panel apparatus, the clinical setting and in-person supervision were not, and in-run difficulty adaptation operated through the build's built-in rule agent rather than the Stage-2 large-language-model layer (Appendix E). Stage 3 thereby changed a package of participant-facing clinical cues: no clinical pre-scan was conducted; the game and its instructions carried no clinical or fall-risk terminology and delivered no participant-facing clinical output; the activity was presented as a purely-fun coordination game; and the interface was re-skinned. The invitation e-mail itself openly disclosed the doctoral research context, including the programme's fall-risk origin — the decoupling operated at the artefact level, not by concealment. Observed non-return was 6.7% overall and 14.6% in the 65-80 band. Among 23 initial dropouts, 15 returned voluntarily; in the 65-80 band, 10 of 16 returned. Coordination-challenge endorsement reached 71.7% and is treated as evidence that the intended frame was perceived, while regular-use intention reached 63.3% overall.</w:t>
+        <w:t>One hundred and twenty adults aged 25-80 were recruited through the author's Hong Kong-based networks — family and personal contacts, work contacts, a charity community network, university support channels and working peers in medical centres. Stage 3 was a remote deployment: the game was ported to an HTML build and distributed by e-mail, and participants played on their own computers, using a trackpad or arrow keys, or a foot-pad sensor where one was available. The skiing mechanic, session structure and five-attempt rule were retained in the ported build; the pressure-panel apparatus, the clinical setting and in-person supervision were not, and in-run difficulty adaptation operated through the build's built-in rule agent rather than the Stage-2 large-language-model layer (Appendix E). Stage 3 thereby changed a package of participant-facing clinical cues: no clinical pre-scan was conducted; the game and its instructions carried no clinical or fall-risk terminology and delivered no participant-facing clinical output; the activity was presented as a purely-fun coordination game; and the interface was re-skinned. The invitation e-mail itself openly disclosed the doctoral research context, including the programme's fall-risk origin — the decoupling operated at the artefact level, not by concealment. The stage's outcomes — participation, dropout and voluntary return by age band, endorsement of the coordination-challenge frame, and stated regular-use intention — are reported in Chapter 6.</w:t>
       </w:r>
     </w:p>
     <w:p>
@@ -7752,7 +7752,7 @@
         <w:jc w:val="both"/>
       </w:pPr>
       <w:r>
-        <w:t>The Stage-3 findings are one-sided between the two readings: the decoupled game was accepted at the levels the gamification literature predicts, a pattern consistent with the theory and the population being sound and with the coupling as the locus of the failure. They do not rule out cohort self-selection, setting, recruitment, health-status, staff-interaction or observation-window differences, so the comparison is described as a between-cohort quasi-experimental decoupling study rather than a single-variable experiment. The residual 29.3-percentage-point difference in the 65-80 band between in-session retention and regular-use intention identifies the practical problem that remained — and it is where the programme found its principal design discovery: adaptive learning, formalised in Chapter 7 as the adaptive-learning framework, as the driver that can make returning worthwhile and eventually carry the clinical purpose back into the experience.</w:t>
+        <w:t>Whatever pattern Stage 3 produced would be read against both candidate explanations, with the design's limits stated in advance: a between-cohort quasi-experimental decoupling study cannot rule out cohort self-selection, setting, recruitment, health-status, staff-interaction or observation-window differences, and it is described accordingly rather than as a single-variable experiment. Chapter 6 reports the outcomes; Chapter 7 develops the design response the programme's evidence motivated — adaptive learning, formalised as the adaptive-learning framework, proposed as the driver that can make returning worthwhile and eventually carry the clinical purpose back into the experience.</w:t>
       </w:r>
     </w:p>
     <w:p>
@@ -7850,7 +7850,7 @@
         <w:jc w:val="both"/>
       </w:pPr>
       <w:r>
-        <w:t>The thesis offers contributions in four registers, and Chapter 8 states them in the hierarchy the evidence supports. Theoretically, the problem finding is FIAS: failure-associated non-return as a post-contact behaviour that standard acceptance and gamification models do not represent, structured by the behavioural-economics account of Table 2.1 (loss aversion, identity-relevant endowment, mental accounting, stereotype threat — proposed as candidate mechanisms, not claimed as directly measured). The scope finding is a boundary condition for gamification theory: the theory transfers to older adults, as the Stage-3 evidence indicates, until the gamified activity is attached to a purpose-based technology whose verdicts touch the user's identity-level value propositions. The design discovery is adaptive learning as the behavioural-change driver — continuous improvement at the level of the individual user — with the adaptive-learning framework as its engineering formalisation and zero-failure presentation as a supporting element. These outputs form one architecture: FIAS explains why users disengage after failure, the adaptive-learning framework states how systems should be redesigned to prevent that disengagement, and the dynamic game-state engine of §5.3.10 operationalises the framework in real time (§7.5A). Methodologically, the thesis contributes the null-hypothesis-plus-attribution architecture (Table 3.1), the dual-purpose mechanic, the QFD evidence-to-design pipeline and the commitment-gap measurement; the AI-assisted development workflow is documented as the enabling method behind the artefact (§5.3.9), not claimed as a contribution — throughout the thesis, the AI tooling is an enabling technology, and the contribution is the behavioural design framework. Empirically, it reports the prospective rejection of H0 in Stage 2 and the theory-consistent acceptance of the decoupled game in Stage 3, with within-cohort confirmation explicitly retained as future work. Practically, it specifies the adaptive-learning principle and the adaptive-learning framework for prospective evaluation on existing infrastructure. Figure 1.1 places the contributions in a single chain from industrial problem to industrial outcome.</w:t>
+        <w:t>The thesis offers contributions in four registers, and Chapter 8 states them in the hierarchy the evidence supports. Theoretically, the problem finding is FIAS: failure-associated non-return as a post-contact behaviour that standard acceptance and gamification models do not represent, structured by the behavioural-economics account of Table 2.1 (loss aversion, identity-relevant endowment, mental accounting, stereotype threat — proposed as candidate mechanisms, not claimed as directly measured). The scope finding is a boundary condition for gamification theory — argued in Chapter 8 from the Chapter 6 evidence: the theory transfers to older adults until the gamified activity is attached to a purpose-based technology whose verdicts touch the user's identity-level value propositions. The design discovery is adaptive learning as the behavioural-change driver — continuous improvement at the level of the individual user — with the adaptive-learning framework as its engineering formalisation and zero-failure presentation as a supporting element. These outputs form one architecture: FIAS explains why users disengage after failure, the adaptive-learning framework states how systems should be redesigned to prevent that disengagement, and the dynamic game-state engine of §5.3.10 operationalises the framework in real time (§7.5A). Methodologically, the thesis contributes the null-hypothesis-plus-attribution architecture (Table 3.1), the dual-purpose mechanic, the QFD evidence-to-design pipeline and the commitment-gap measurement; the AI-assisted development workflow is documented as the enabling method behind the artefact (§5.3.9), not claimed as a contribution — throughout the thesis, the AI tooling is an enabling technology, and the contribution is the behavioural design framework. Empirically, it reports the Stage-2 prospective test of H0 and the Stage-3 decoupling outcomes (Chapters 5 and 6), with within-cohort confirmation explicitly retained as future work. Practically, it specifies the adaptive-learning principle and the adaptive-learning framework for prospective evaluation on existing infrastructure. Figure 1.1 places the contributions in a single chain from industrial problem to industrial outcome.</w:t>
       </w:r>
     </w:p>
     <w:p>
@@ -7912,7 +7912,7 @@
         <w:jc w:val="both"/>
       </w:pPr>
       <w:r>
-        <w:t>This section speaks from the end of the journey: like the rest of Chapter 1 it was written with the completed programme in view, and it states in advance the boundaries of claims that the later chapters develop, with forward references marking where each is established. The empirical claims are restricted to the cohorts and observation windows studied. Stage 2 involved a Southern Chinese residential-facility cohort; Stage 3 involved a Hong Kong network-recruited cohort playing remotely on their own computers. Both were Chinese-cultural in language and cultural context, and cross-cultural generalisation is not asserted. The FRA system is an established commercial assessment platform, but this thesis does not validate its diagnostic accuracy, clinical effectiveness or the clinical significance of short-term score changes. It evaluates engagement behaviour and the engineering design of the user interaction. FIAS is not claimed to explain all non-adoption or abandonment of health technology, and "syndrome" is used as a conceptual, non-diagnostic term. Cross-domain application to glucose monitoring, sleep tracking, cognitive screening and other systems remains a design hypothesis.</w:t>
+        <w:t>The empirical claims are restricted to the cohorts and observation windows studied. Stage 2 involved a Southern Chinese residential-facility cohort; Stage 3 involved a Hong Kong network-recruited cohort playing remotely on their own computers. Both were Chinese-cultural in language and cultural context, and cross-cultural generalisation is not asserted. The FRA system is an established commercial assessment platform, but this thesis does not validate its diagnostic accuracy, clinical effectiveness or the clinical significance of short-term score changes. It evaluates engagement behaviour and the engineering design of the user interaction. FIAS is not claimed to explain all non-adoption or abandonment of health technology, and "syndrome" is used as a conceptual, non-diagnostic term. Cross-domain application to glucose monitoring, sleep tracking, cognitive screening and other systems remains a design hypothesis.</w:t>
       </w:r>
     </w:p>
     <w:p>
@@ -7920,7 +7920,7 @@
         <w:jc w:val="both"/>
       </w:pPr>
       <w:r>
-        <w:t>The thesis will not claim that adaptive learning is the only design lever capable of reducing failure-associated non-return. Adaptive learning is proposed — in the framework Chapter 7 develops — because trajectory framing, mastery-oriented feedback and calibrated challenge are theoretically suited to changing how failure is interpreted. The 29.3-percentage-point commitment gap that Chapter 6 will report does not identify adaptive learning as its sole cause; fatigue, physical capacity, access, session burden and other motivational factors remain viable alternatives. Direct comparison of design levers and controlled evaluation of the complete adaptive-learning framework are therefore required, and are specified as the confirmatory programme of §8.8.</w:t>
+        <w:t>The thesis does not claim that adaptive learning is the only design lever capable of reducing failure-associated non-return. Adaptive learning is proposed because trajectory framing, mastery-oriented feedback and calibrated challenge are theoretically suited to changing how failure is interpreted. Should the field stages observe gaps between what participants endorse and what they commit to, such gaps would not by themselves identify adaptive learning as their cause; fatigue, physical capacity, access, session burden and other motivational factors would remain viable alternatives. Direct comparison of design levers and controlled evaluation of the complete adaptive-learning framework lie beyond this thesis's scope and are specified as future confirmatory work.</w:t>
       </w:r>
     </w:p>
     <w:p>

</xml_diff>

<commit_message>
Extend writing-logic standard to constructs: remove all FIAS mentions from Chapters 1-2
FIDS stays as the pre-research conjecture; FIAS now first appears in Chapter 4 where the journey produced it, preserving the FIDS-to-FIAS transition as a guarded finding. 22 edits: headings 2.5/2.5.6 renamed, Table 2.1 caption and headers reworded, para 2.6 de-resulted (70%/6.7%/29.3pp removed), Figure 1.1 graphic flagged for author check. Scan confirms zero FIAS in Ch1-2 body.

Co-Authored-By: Claude Fable 5 <noreply@anthropic.com>
Claude-Session: https://claude.ai/code/session_01KoT3i8geZspYBMMKVYJUTG
</commit_message>
<xml_diff>
--- a/docs/thesis/Full_version_V37_REVIEW_EngD_Thesis_Submission_Draft.docx
+++ b/docs/thesis/Full_version_V37_REVIEW_EngD_Thesis_Submission_Draft.docx
@@ -7588,7 +7588,7 @@
           <w:rFonts w:ascii="Times New Roman" w:hAnsi="Times New Roman" w:eastAsia="Times New Roman" w:cs="Times New Roman"/>
           <w:sz w:val="24"/>
         </w:rPr>
-        <w:t>The author initially named the conjecture Failure-Induced Dropout Syndrome (FIDS). The label captured the hypothesised timing and direction of the response. Stage 1 was designed to determine whether residents' retrospective reports were consistent with that conjecture, while Stage 2 examined the pattern prospectively. The later term Failure-Induced Abandonment Syndrome (FIAS) was adopted to emphasise active non-return rather than administrative study dropout. Throughout this thesis, "syndrome" is used as a conceptual label for a proposed behavioural pattern, not as a clinical diagnosis, and the construct remains provisional pending independent reliability and construct-validity testing. Methodologically, the conjecture and the literature's expectation were kept in explicit tension: Chapter 2 formalises the literature's expectation as the null hypothesis H0 — that a well-designed gamified FRA would be accepted and would not suffer failure-driven abandonment — and the empirical stages test H0 with the conjecture standing as its rival. The architecture that governs which claim is stated, tested and resolved where, is set out in Table 3.1. This thesis proposes FIAS as a provisional behavioural construct developed from the observed interaction patterns in this research programme; its definition, evidential status and limits are developed in Chapters 4 and 5.</w:t>
+        <w:t>The author initially named the conjecture Failure-Induced Dropout Syndrome (FIDS). The label captured the hypothesised timing and direction of the response. Stage 1 was designed to determine whether residents' retrospective reports were consistent with that conjecture, while Stage 2 examined the pattern prospectively. Whether the conjecture's name and definition would survive contact with the field is itself part of the journey Chapters 4 and 5 report. Throughout this thesis, "syndrome" is used as a conceptual label for a proposed behavioural pattern, not as a clinical diagnosis, and any construct developed from the conjecture remains provisional pending independent reliability and construct-validity testing. Methodologically, the conjecture and the literature's expectation were kept in explicit tension: Chapter 2 formalises the literature's expectation as the null hypothesis H0 — that a well-designed gamified FRA would be accepted and would not suffer failure-driven abandonment — and the empirical stages test H0 with the conjecture standing as its rival. The architecture that governs which claim is stated, tested and resolved where, is set out in Table 3.1.</w:t>
       </w:r>
     </w:p>
     <w:p>
@@ -7651,7 +7651,7 @@
           <w:rFonts w:ascii="Times New Roman" w:hAnsi="Times New Roman" w:eastAsia="Times New Roman" w:cs="Times New Roman"/>
           <w:sz w:val="24"/>
         </w:rPr>
-        <w:t>What the survey could establish, and what it could not, defined the next step. A retrospective instrument cannot establish the timing of a psychological collapse, irreversible abandonment, or the mechanism of non-return; whatever pattern it recorded would require direct prospective investigation. Stage 1's role in the architecture was therefore to test whether residents' reports were consistent with the FIDS conjecture and to generate the questions Stage 2 would examine prospectively; the FIDS-to-FIAS terminological revision described in Chapter 4 emerged from that interpretation.</w:t>
+        <w:t>What the survey could establish, and what it could not, defined the next step. A retrospective instrument cannot establish the timing of a psychological collapse, irreversible abandonment, or the mechanism of non-return; whatever pattern it recorded would require direct prospective investigation. Stage 1's role in the architecture was therefore to test whether residents' reports were consistent with the FIDS conjecture and to generate the questions Stage 2 would examine prospectively; whether the conjecture's own name would require revision in the light of the field evidence is taken up in Chapter 4.</w:t>
       </w:r>
     </w:p>
     <w:p>
@@ -7675,7 +7675,7 @@
         <w:jc w:val="both"/>
       </w:pPr>
       <w:r>
-        <w:t>Stage 2 was designed to bring the FIDS-to-FIAS distinction into sharper empirical focus. Thirty residents participated over eight weeks in an action-research deployment of a dual-purpose AI-assisted skiing game on the InBody pressure panel. The design attended closely to the relationship between recorded score change and subsequent return: if behaviour were to track the direction of recorded change, acceptance models would suffice; if not, something else would be at work. A methodological guard was set in advance: a single-session change may include measurement variation, familiarisation, practice effects or short-term motor adaptation, and is not interpreted as clinical benefit unless it exceeds a validated measurement-error or clinical-significance threshold. The session-level records, the F4 cluster and the behavioural outcomes are reported in Chapter 5.</w:t>
+        <w:t>Stage 2 was designed to test the FIDS conjecture prospectively and at close range. Thirty residents participated over eight weeks in an action-research deployment of a dual-purpose AI-assisted skiing game on the InBody pressure panel. The design attended closely to the relationship between recorded score change and subsequent return: if behaviour were to track the direction of recorded change, acceptance models would suffice; if not, something else would be at work. A methodological guard was set in advance: a single-session change may include measurement variation, familiarisation, practice effects or short-term motor adaptation, and is not interpreted as clinical benefit unless it exceeds a validated measurement-error or clinical-significance threshold. The session-level records, the F4 cluster and the behavioural outcomes are reported in Chapter 5.</w:t>
       </w:r>
     </w:p>
     <w:p>
@@ -7780,7 +7780,7 @@
         <w:jc w:val="both"/>
       </w:pPr>
       <w:r>
-        <w:t>Second, the action-research relationship with the Poly Group facility was sustained across Stages 1 and 2. The same management office and nursing team supported the work, and some residents contributed across overlapping observation periods. Stage 3, by contrast, was conducted remotely with a separate cohort recruited through the author's Hong Kong-based networks, playing an e-mailed HTML build of the game on their own computers. The action-research cycle therefore involved continuity of problem setting and design learning, not a single repeated cohort across all three stages. The principal theoretical revisions were the movement from FIDS toward the provisional FIAS construct, the shift from a predominantly dispositional reading toward a frame-sensitive account after Stage 3, and the formulation of adaptive learning as a design hypothesis expressed through the adaptive-learning framework.</w:t>
+        <w:t>Second, the action-research relationship with the Poly Group facility was sustained across Stages 1 and 2. The same management office and nursing team supported the work, and some residents contributed across overlapping observation periods. Stage 3, by contrast, was conducted remotely with a separate cohort recruited through the author's Hong Kong-based networks, playing an e-mailed HTML build of the game on their own computers. The action-research cycle therefore involved continuity of problem setting and design learning, not a single repeated cohort across all three stages. The principal theoretical revisions were the renaming and re-specification of the initial FIDS conjecture in the light of the Stage-2 field evidence (Chapter 4), the shift from a predominantly dispositional reading toward a frame-sensitive account after Stage 3, and the formulation of adaptive learning as a design hypothesis expressed through the adaptive-learning framework.</w:t>
       </w:r>
     </w:p>
     <w:p>
@@ -7850,7 +7850,7 @@
         <w:jc w:val="both"/>
       </w:pPr>
       <w:r>
-        <w:t>The thesis offers contributions in four registers, and Chapter 8 states them in the hierarchy the evidence supports. Theoretically, the problem finding is FIAS: failure-associated non-return as a post-contact behaviour that standard acceptance and gamification models do not represent, structured by the behavioural-economics account of Table 2.1 (loss aversion, identity-relevant endowment, mental accounting, stereotype threat — proposed as candidate mechanisms, not claimed as directly measured). The scope finding is a boundary condition for gamification theory — argued in Chapter 8 from the Chapter 6 evidence: the theory transfers to older adults until the gamified activity is attached to a purpose-based technology whose verdicts touch the user's identity-level value propositions. The design discovery is adaptive learning as the behavioural-change driver — continuous improvement at the level of the individual user — with the adaptive-learning framework as its engineering formalisation and zero-failure presentation as a supporting element. These outputs form one architecture: FIAS explains why users disengage after failure, the adaptive-learning framework states how systems should be redesigned to prevent that disengagement, and the dynamic game-state engine of §5.3.10 operationalises the framework in real time (§7.5A). Methodologically, the thesis contributes the null-hypothesis-plus-attribution architecture (Table 3.1), the dual-purpose mechanic, the QFD evidence-to-design pipeline and the commitment-gap measurement; the AI-assisted development workflow is documented as the enabling method behind the artefact (§5.3.9), not claimed as a contribution — throughout the thesis, the AI tooling is an enabling technology, and the contribution is the behavioural design framework. Empirically, it reports the Stage-2 prospective test of H0 and the Stage-3 decoupling outcomes (Chapters 5 and 6), with within-cohort confirmation explicitly retained as future work. Practically, it specifies the adaptive-learning principle and the adaptive-learning framework for prospective evaluation on existing infrastructure. Figure 1.1 places the contributions in a single chain from industrial problem to industrial outcome.</w:t>
+        <w:t>The thesis offers contributions in four registers, and Chapter 8 states them in the hierarchy the evidence supports. Theoretically, the problem finding is a newly named abandonment construct — failure-associated non-return as a post-contact behaviour that standard acceptance and gamification models do not represent, structured by the behavioural-economics account of Table 2.1 (loss aversion, identity-relevant endowment, mental accounting, stereotype threat — proposed as candidate mechanisms, not claimed as directly measured). The scope finding is a boundary condition for gamification theory — argued in Chapter 8 from the Chapter 6 evidence: the theory transfers to older adults until the gamified activity is attached to a purpose-based technology whose verdicts touch the user's identity-level value propositions. The design discovery is adaptive learning as the behavioural-change driver — continuous improvement at the level of the individual user — with the adaptive-learning framework as its engineering formalisation and zero-failure presentation as a supporting element. These outputs form one architecture: the abandonment construct explains why users disengage after failure, the adaptive-learning framework states how systems should be redesigned to prevent that disengagement, and the dynamic game-state engine of §5.3.10 operationalises the framework in real time (§7.5A). Methodologically, the thesis contributes the null-hypothesis-plus-attribution architecture (Table 3.1), the dual-purpose mechanic, the QFD evidence-to-design pipeline and the commitment-gap measurement; the AI-assisted development workflow is documented as the enabling method behind the artefact (§5.3.9), not claimed as a contribution — throughout the thesis, the AI tooling is an enabling technology, and the contribution is the behavioural design framework. Empirically, it reports the Stage-2 prospective test of H0 and the Stage-3 decoupling outcomes (Chapters 5 and 6), with within-cohort confirmation explicitly retained as future work. Practically, it specifies the adaptive-learning principle and the adaptive-learning framework for prospective evaluation on existing infrastructure. Figure 1.1 places the contributions in a single chain from industrial problem to industrial outcome.</w:t>
       </w:r>
     </w:p>
     <w:p>
@@ -7894,7 +7894,13 @@
         <w:pStyle w:val="FigureCaption"/>
       </w:pPr>
       <w:r>
-        <w:t>Figure 1.1. The intellectual structure of the thesis: an industrial problem produces an observed behavioural phenomenon (FIAS); the phenomenon motivates engineering design principles (the adaptive-learning framework); the principles are operationalised by the dynamic game-state engine; and the intended industrial outcome is sustained engagement with clinical validity preserved. The three middle layers are stated as one architecture in §7.5A.</w:t>
+        <w:t>Figure 1.1. The intellectual structure of the thesis: an industrial problem produces an observed behavioural phenomenon (the abandonment construct developed in Chapters 4 and 5); the phenomenon motivates engineering design principles (the adaptive-learning framework); the principles are operationalised by the dynamic game-state engine; and the intended industrial outcome is sustained engagement with clinical validity preserved. The three middle layers are stated as one architecture in §7.5A.</w:t>
+      </w:r>
+      <w:r>
+        <w:rPr>
+          <w:highlight w:val="yellow"/>
+        </w:rPr>
+        <w:t xml:space="preserve"> [AUTHOR CHECK: if the Figure 1.1 graphic itself carries the construct's name, regenerate the graphic or approve the mention.]</w:t>
       </w:r>
     </w:p>
     <w:p>
@@ -7912,7 +7918,7 @@
         <w:jc w:val="both"/>
       </w:pPr>
       <w:r>
-        <w:t>The empirical claims are restricted to the cohorts and observation windows studied. Stage 2 involved a Southern Chinese residential-facility cohort; Stage 3 involved a Hong Kong network-recruited cohort playing remotely on their own computers. Both were Chinese-cultural in language and cultural context, and cross-cultural generalisation is not asserted. The FRA system is an established commercial assessment platform, but this thesis does not validate its diagnostic accuracy, clinical effectiveness or the clinical significance of short-term score changes. It evaluates engagement behaviour and the engineering design of the user interaction. FIAS is not claimed to explain all non-adoption or abandonment of health technology, and "syndrome" is used as a conceptual, non-diagnostic term. Cross-domain application to glucose monitoring, sleep tracking, cognitive screening and other systems remains a design hypothesis.</w:t>
+        <w:t>The empirical claims are restricted to the cohorts and observation windows studied. Stage 2 involved a Southern Chinese residential-facility cohort; Stage 3 involved a Hong Kong network-recruited cohort playing remotely on their own computers. Both were Chinese-cultural in language and cultural context, and cross-cultural generalisation is not asserted. The FRA system is an established commercial assessment platform, but this thesis does not validate its diagnostic accuracy, clinical effectiveness or the clinical significance of short-term score changes. It evaluates engagement behaviour and the engineering design of the user interaction. The abandonment construct developed in Chapters 4 and 5 is not claimed to explain all non-adoption or abandonment of health technology, and "syndrome" is used there as a conceptual, non-diagnostic term. Cross-domain application to glucose monitoring, sleep tracking, cognitive screening and other systems remains a design hypothesis.</w:t>
       </w:r>
     </w:p>
     <w:p>
@@ -8008,7 +8014,7 @@
         <w:jc w:val="both"/>
       </w:pPr>
       <w:r>
-        <w:t>Stage four assembles the alternative account. Prospect theory and loss aversion (Kahneman &amp; Tversky, 1979), the endowment effect on identity-relevant assets, mental accounting (Thaler, 1985) and stereotype threat (Steele &amp; Aronson, 1995) are organised — in Table 2.1 — as a structured explanation of exactly the observations that the null hypothesis cannot accommodate. This integration is the theoretical contribution of the thesis and is named FIAS. The individual operators were not directly measured in the empirical stages, and the chapter says so wherever it matters.</w:t>
+        <w:t>Stage four assembles the alternative account. Prospect theory and loss aversion (Kahneman &amp; Tversky, 1979), the endowment effect on identity-relevant assets, mental accounting (Thaler, 1985) and stereotype threat (Steele &amp; Aronson, 1995) are organised — in Table 2.1 — as a structured candidate explanation for the class of observations that the null hypothesis could not accommodate, should the stages produce them. The integration is developed into the thesis's central theoretical construct in Chapter 5. The individual operators are not directly measured by the empirical stages, and the chapter says so wherever it matters.</w:t>
       </w:r>
     </w:p>
     <w:p>
@@ -8081,7 +8087,7 @@
         <w:jc w:val="both"/>
       </w:pPr>
       <w:r>
-        <w:t>Chen and Chan (2014) developed STAM through a study of 1,012 Hong Kong Chinese seniors aged 55 and above. STAM extends TAM with five constructs particularly relevant to older users: gerontechnology self-efficacy (GSE), gerontechnology anxiety (GA), facilitating conditions, behavioural intention, and the dual subjective norms of family and peer influence. Chen and Chan reported that STAM explained 68% of the variance in self-reported gerontechnology use among their sample, a substantial improvement on TAM in the same population. Recent mapping reviews of the factors associated with older adults' intention to adopt digital technologies confirm that these constructs remain central to the field (Schroeder et al., 2023). STAM is therefore the strongest baseline available for elderly technology adoption, and it supplies five of the thirteen binary attributes in the FIAS coding scheme described in Chapter 5 and Appendix B.</w:t>
+        <w:t>Chen and Chan (2014) developed STAM through a study of 1,012 Hong Kong Chinese seniors aged 55 and above. STAM extends TAM with five constructs particularly relevant to older users: gerontechnology self-efficacy (GSE), gerontechnology anxiety (GA), facilitating conditions, behavioural intention, and the dual subjective norms of family and peer influence. Chen and Chan reported that STAM explained 68% of the variance in self-reported gerontechnology use among their sample, a substantial improvement on TAM in the same population. Recent mapping reviews of the factors associated with older adults' intention to adopt digital technologies confirm that these constructs remain central to the field (Schroeder et al., 2023). STAM is therefore the strongest baseline available for elderly technology adoption, and it supplies five of the thirteen binary attributes in the abandonment-construct coding scheme described in Chapter 5 and Appendix B.</w:t>
       </w:r>
     </w:p>
     <w:p>
@@ -8174,7 +8180,7 @@
           <w:rFonts w:ascii="Times New Roman" w:hAnsi="Times New Roman" w:eastAsia="Times New Roman" w:cs="Times New Roman"/>
           <w:sz w:val="24"/>
         </w:rPr>
-        <w:t>The studies share two boundary conditions that the present thesis treats as load-bearing. First, mobile payments and mobile maps are not clinical or diagnostic technologies. The user's identity asset, in the sense developed at stage four below, is not at stake in the same way. Second, the An et al. studies measured initial adoption and short-term engagement; they did not document the one-way abandonment pattern that characterises FIAS. Stage two of the transformative chain therefore indicates that the TAM-STAM-Octalysis stack is empirically valid for elderly gamification — provided the technology is not attached to an artefact-based health system.</w:t>
+        <w:t>The studies share two boundary conditions that the present thesis treats as load-bearing. First, mobile payments and mobile maps are not clinical or diagnostic technologies. The user's identity asset, in the sense developed at stage four below, is not at stake in the same way. Second, the An et al. studies measured initial adoption and short-term engagement; they did not document the one-way abandonment pattern this thesis investigates. Stage two of the transformative chain therefore indicates that the TAM-STAM-Octalysis stack is empirically valid for elderly gamification — provided the technology is not attached to an artefact-based health system.</w:t>
       </w:r>
     </w:p>
     <w:p>
@@ -8477,7 +8483,7 @@
           <w:sz w:val="28"/>
           <w:szCs w:val="26"/>
         </w:rPr>
-        <w:t>2.5 Stage Four: Behavioural Science as a Candidate FIAS Account</w:t>
+        <w:t>2.5 Stage Four: Behavioural Science as a Candidate Account of Failure-Associated Non-Return</w:t>
       </w:r>
     </w:p>
     <w:p>
@@ -8508,7 +8514,7 @@
           <w:rFonts w:ascii="Times New Roman" w:hAnsi="Times New Roman" w:eastAsia="Times New Roman" w:cs="Times New Roman"/>
           <w:sz w:val="24"/>
         </w:rPr>
-        <w:t>The transition from self-efficacy to behavioural economics is the substantive theoretical move of the thesis, and its structure follows directly from the rejected null hypothesis. Self-efficacy explains reduced persistence after difficulty, and it also allows recovery — so it cannot, on its own, account for what Stage 2 observed. Three observations from the rejection of H0 need explaining: first failure carried far more behavioural weight than the design predicted; exits persisted even when recorded scores improved; and the same gameplay event appears to mean something different under a clinical frame than under a game frame. Table 2.1 maps each observation onto the behavioural theory recruited to explain it, the construct that theory contributes to FIAS, and the testable prediction it generates. The subsections that follow develop each row. The operators were not directly measured in the present studies; the table is the structure that future measurement (§3.6) is designed to fill.</w:t>
+        <w:t>The transition from self-efficacy to behavioural economics is the substantive theoretical move of the thesis, and its structure follows directly from the contingency the null hypothesis makes testable: the case in which H0 fails. Self-efficacy explains reduced persistence after difficulty, and it also allows recovery — so it cannot, on its own, account for what Stage 2 observed. Three observations from the rejection of H0 need explaining: first failure carried far more behavioural weight than the design predicted; exits persisted even when recorded scores improved; and the same gameplay event appears to mean something different under a clinical frame than under a game frame. Table 2.1 maps each observation onto the behavioural theory recruited to explain it, the construct that theory contributes to the candidate account, and the testable prediction it generates. The subsections that follow develop each row. The operators are not directly measured by the present studies; the table is the structure that future measurement (§3.6) is designed to fill.</w:t>
       </w:r>
     </w:p>
     <w:p>
@@ -8523,7 +8529,7 @@
           <w:rFonts w:ascii="Times New Roman" w:hAnsi="Times New Roman" w:eastAsia="Times New Roman" w:cs="Times New Roman"/>
           <w:i/>
         </w:rPr>
-        <w:t>Table 2.1. From the rejected null hypothesis to candidate mechanisms: the structure of the FIAS account.</w:t>
+        <w:t>Table 2.1. From the null hypothesis's failure case to candidate mechanisms: the structure of the candidate behavioural account.</w:t>
       </w:r>
     </w:p>
     <w:tbl>
@@ -8544,6 +8550,16 @@
             <w:tcW w:type="dxa" w:w="2126"/>
           </w:tcPr>
           <w:p>
+            <w:r>
+              <w:t>Observation class H0 cannot accommodate</w:t>
+            </w:r>
+          </w:p>
+        </w:tc>
+        <w:tc>
+          <w:tcPr>
+            <w:tcW w:type="dxa" w:w="2126"/>
+          </w:tcPr>
+          <w:p>
             <w:pPr>
               <w:pStyle w:val="Normal"/>
             </w:pPr>
@@ -8555,7 +8571,7 @@
                 <w:lang w:val="en-US" w:eastAsia="en-US" w:bidi="ar-SA"/>
                 <w:rFonts w:ascii="Times New Roman" w:hAnsi="Times New Roman" w:eastAsia="Times New Roman" w:cs="Times New Roman"/>
               </w:rPr>
-              <w:t>Observation H0 cannot explain</w:t>
+              <w:t>Behavioural theory</w:t>
             </w:r>
           </w:p>
         </w:tc>
@@ -8564,38 +8580,8 @@
             <w:tcW w:type="dxa" w:w="2126"/>
           </w:tcPr>
           <w:p>
-            <w:pPr>
-              <w:pStyle w:val="Normal"/>
-            </w:pPr>
-            <w:r>
-              <w:rPr>
-                <w:b/>
-                <w:sz w:val="20"/>
-                <w:szCs w:val="22"/>
-                <w:lang w:val="en-US" w:eastAsia="en-US" w:bidi="ar-SA"/>
-                <w:rFonts w:ascii="Times New Roman" w:hAnsi="Times New Roman" w:eastAsia="Times New Roman" w:cs="Times New Roman"/>
-              </w:rPr>
-              <w:t>Behavioural theory</w:t>
-            </w:r>
-          </w:p>
-        </w:tc>
-        <w:tc>
-          <w:tcPr>
-            <w:tcW w:type="dxa" w:w="2126"/>
-          </w:tcPr>
-          <w:p>
-            <w:pPr>
-              <w:pStyle w:val="Normal"/>
-            </w:pPr>
-            <w:r>
-              <w:rPr>
-                <w:b/>
-                <w:sz w:val="20"/>
-                <w:szCs w:val="22"/>
-                <w:lang w:val="en-US" w:eastAsia="en-US" w:bidi="ar-SA"/>
-                <w:rFonts w:ascii="Times New Roman" w:hAnsi="Times New Roman" w:eastAsia="Times New Roman" w:cs="Times New Roman"/>
-              </w:rPr>
-              <w:t>Construct contributed to FIAS</w:t>
+            <w:r>
+              <w:t>Construct contributed to the account</w:t>
             </w:r>
           </w:p>
         </w:tc>
@@ -9186,7 +9172,7 @@
           <w:b/>
           <w:color w:val="000000"/>
         </w:rPr>
-        <w:t>2.5.6 A Four-Layer Behavioural Integration Proposed for FIAS</w:t>
+        <w:t>2.5.6 A Four-Layer Behavioural Integration for Failure-Associated Non-Return</w:t>
       </w:r>
     </w:p>
     <w:p>
@@ -9201,7 +9187,7 @@
           <w:rFonts w:ascii="Times New Roman" w:hAnsi="Times New Roman" w:eastAsia="Times New Roman" w:cs="Times New Roman"/>
           <w:sz w:val="24"/>
         </w:rPr>
-        <w:t>The four behavioural-science layers form a coherent candidate explanation. Loss aversion supplies asymmetric weighting of unfavourable information; identity-relevant endowment supplies a possible protected self-concept; mental accounting supplies a possible sorting rule by which clinical framing increases the stakes of the event; and stereotype threat supplies one possible contextual trigger. FIAS is the conceptual label assigned to the resulting pattern of failure-associated active non-return. The integration is theoretically generative because it yields measurable predictions, but it is not yet a validated latent construct or a clinical syndrome. Direct measures of appraisal, identity threat, account framing and WTA-WTP asymmetry are required before the mechanism can be claimed as established.</w:t>
+        <w:t>The four behavioural-science layers form a coherent candidate explanation. Loss aversion supplies asymmetric weighting of unfavourable information; identity-relevant endowment supplies a possible protected self-concept; mental accounting supplies a possible sorting rule by which clinical framing increases the stakes of the event; and stereotype threat supplies one possible contextual trigger. the candidate account is the conceptual label assigned to the resulting pattern of failure-associated active non-return. The integration is theoretically generative because it yields measurable predictions, but it is not yet a validated latent construct or a clinical syndrome. Direct measures of appraisal, identity threat, account framing and WTA-WTP asymmetry are required before the mechanism can be claimed as established.</w:t>
       </w:r>
     </w:p>
     <w:p>
@@ -9362,7 +9348,7 @@
           <w:rFonts w:ascii="Times New Roman" w:hAnsi="Times New Roman" w:eastAsia="Times New Roman" w:cs="Times New Roman"/>
           <w:sz w:val="24"/>
         </w:rPr>
-        <w:t>Two established motivation literatures support the trajectory-installation principle that Chapter 7 develops. Self-determination theory (Deci &amp; Ryan, 1985; Ryan &amp; Deci, 2000) identifies competence and autonomy as basic psychological needs. A user who reads performance against an evolving personal capability receives competence feedback; a user who reads performance against a fixed clinical verdict does not. The trajectory frame is therefore a competence-support structure in self-determination terms. Goal-setting theory (Locke &amp; Latham, 2002) adds a second scaffold: specific, proximal and adjustable goals sustain effort better than vague or static ones, and the related distinction between mastery goals and performance goals (Elliot &amp; Murayama, 2008) sharpens the point: a goal defined by personal improvement invites a different reading of failure than a goal defined by demonstrated adequacy. The adaptive calibration principle operationalises exactly this, because the difficulty layer keeps the next goal specific and reachable as capability changes. Motivation-crowding research adds a design caution: extrinsic rewards that are introduced clumsily can displace rather than support intrinsic motivation (Frey &amp; Jegen, 2001), which is why the learn-to-earn philosophy treats rewards as recognition of progress along the curve rather than as payment for compliance. Neither literature predicts the abandonment cliff that FIAS names. Both literatures predict why the trajectory frame, once installed, should hold engagement. They scaffold the design response; they do not substitute for the coupling mechanism that explains the collapse.</w:t>
+        <w:t>Two established motivation literatures support the trajectory-installation principle that Chapter 7 develops. Self-determination theory (Deci &amp; Ryan, 1985; Ryan &amp; Deci, 2000) identifies competence and autonomy as basic psychological needs. A user who reads performance against an evolving personal capability receives competence feedback; a user who reads performance against a fixed clinical verdict does not. The trajectory frame is therefore a competence-support structure in self-determination terms. Goal-setting theory (Locke &amp; Latham, 2002) adds a second scaffold: specific, proximal and adjustable goals sustain effort better than vague or static ones, and the related distinction between mastery goals and performance goals (Elliot &amp; Murayama, 2008) sharpens the point: a goal defined by personal improvement invites a different reading of failure than a goal defined by demonstrated adequacy. The adaptive calibration principle operationalises exactly this, because the difficulty layer keeps the next goal specific and reachable as capability changes. Motivation-crowding research adds a design caution: extrinsic rewards that are introduced clumsily can displace rather than support intrinsic motivation (Frey &amp; Jegen, 2001), which is why the learn-to-earn philosophy treats rewards as recognition of progress along the curve rather than as payment for compliance. Neither literature predicts the abandonment cliff this thesis names in Chapter 5. Both literatures predict why the trajectory frame, once installed, should hold engagement. They scaffold the design response; they do not substitute for the coupling mechanism that explains the collapse.</w:t>
       </w:r>
     </w:p>
     <w:p>
@@ -9421,7 +9407,7 @@
           <w:sz w:val="28"/>
           <w:b/>
         </w:rPr>
-        <w:t>The evidential status of the concept must be stated carefully, in three steps. First, the Stage-2 build already softened the in-game loss economy substantially — three lives, a neutral first hit, an obstacle-clearing second hit (Table 5.0) — yet retained a conventional terminal Game Over, and FIAS occurred regardless: seventy per cent early disengagement and no observed return (Chapter 5). Softening in-game loss alone was therefore insufficient, which is precisely what the identity-level account predicts. Second, this motivated the complete zero-failure repertoire — non-terminal recovery, mastery, narrative and reframe states — specified at §5.3.10 and implemented in the successor short-run build used for the Stage-3 apparatus lineage. Third, Stage 3 changed the participant-facing frame and the cohort together, so the isolated causal effect of the zero-failure component has not yet been measured; observed non-return fell to 6.7 per cent overall, but a residual non-return and the 29.3-percentage-point commitment gap remained. Zero-failure design is therefore a moderator within the FIAS account and a testable component of the adaptive-learning framework (Chapter 7), not a demonstrated cure; its isolated evaluation is pre-specified in the randomised study of §8.8.</w:t>
+        <w:t>The evidential status of the concept must be stated carefully. The Stage-2 build softens the in-game loss economy substantially — three lives, a neutral first hit, an obstacle-clearing second hit (Table 5.0) — yet retains a conventional terminal Game Over; whether softened in-game loss alone suffices is one of the questions Chapter 5 examines. The complete zero-failure repertoire — non-terminal recovery, mastery, narrative and reframe states — is specified at §5.3.10 and implemented in the successor short-run build used for the Stage-3 apparatus lineage. And because Stage 3 changes the participant-facing frame and the cohort together, the isolated causal effect of the zero-failure component is not measured within the main stages (Chapter 6). Zero-failure design is therefore treated as a candidate moderator within the behavioural account and a testable component of the adaptive-learning framework (Chapter 7), not a demonstrated cure; its isolated evaluation is pre-specified in the randomised study of §8.8.</w:t>
       </w:r>
     </w:p>
     <w:p>
@@ -9603,7 +9589,7 @@
           <w:sz w:val="28"/>
           <w:b/>
         </w:rPr>
-        <w:t>Greenhalgh et al. (2017) introduced the Non-Adoption, Abandonment, Scale-up, Spread and Sustainability (NASSS) framework for health and care technologies. NASSS catalogues forms of non-adoption and abandonment across condition, technology, value proposition, adopter system, organisation, wider context, and embedding over time. The human-computer-interaction literature makes the complementary point that non-use is itself meaningful behaviour rather than a mere absence of use (Satchell &amp; Dourish, 2009). The present thesis can be read as proposing one candidate micro-mechanism within the adopter-system domain: failure-associated non-return that may be amplified when a clinical frame makes performance identity-relevant. NASSS supplies a macro-level vocabulary; FIAS remains a provisional mechanism-level construct requiring independent validation.</w:t>
+        <w:t>Greenhalgh et al. (2017) introduced the Non-Adoption, Abandonment, Scale-up, Spread and Sustainability (NASSS) framework for health and care technologies. NASSS catalogues forms of non-adoption and abandonment across condition, technology, value proposition, adopter system, organisation, wider context, and embedding over time. The human-computer-interaction literature makes the complementary point that non-use is itself meaningful behaviour rather than a mere absence of use (Satchell &amp; Dourish, 2009). The present thesis can be read as proposing one candidate micro-mechanism within the adopter-system domain: failure-associated non-return that may be amplified when a clinical frame makes performance identity-relevant. NASSS supplies a macro-level vocabulary; the mechanism-level construct this thesis develops (Chapter 5) remains provisional, requiring independent validation.</w:t>
       </w:r>
     </w:p>
     <w:p>
@@ -9705,7 +9691,7 @@
           <w:sz w:val="28"/>
           <w:b/>
         </w:rPr>
-        <w:t>The argument of this chapter can now be read in five plain steps. Step one: the acceptance literature says that fitting a technology to the user's acceptance criteria produces intention and use, and the gamification literature says game mechanics amplify this for older adults — together they yield the null hypothesis H0 of §2.3.5, that a well-made gamified FRA will be accepted and used, and that failure will not drive abandonment. Step two: the data reject H0 — retrospectively in Stage 1 (Chapter 4) and prospectively in Stage 2 (Chapter 5), where seventy per cent of participants disengaged early and none returned, despite an AI-assisted build that satisfied the stack's design criteria. Step three: self-efficacy explains the dropout but not its permanence, and not the improvement/non-return paradox. Step four: the behavioural-economics account structured in Table 2.1 — loss aversion, identity-relevant endowment, mental accounting, stereotype threat — explains precisely the observations H0 cannot, and is named FIAS. Step five: the account implies a design response whose centre is adaptive learning — challenge calibrated to the individual and failure reframed as information about a personal trajectory (§2.6.2A–B) — the behavioural-change driver this programme regards as its principal design discovery. Two components support it: participant-facing decoupling, for which Stage 3 (Chapter 6) provides between-cohort field evidence, and zero-failure presentation, the observation-driven inversion of Octalysis D8 (§2.6.2C). The adaptive-learning framework (Chapter 7) is the engineering formalisation of the adaptive-learning proposition, and it awaits prospective testing.</w:t>
+        <w:t>The argument of this chapter can now be read in five plain steps. Step one: the acceptance literature says that fitting a technology to the user's acceptance criteria produces intention and use, and the gamification literature says game mechanics amplify this for older adults — together they yield the null hypothesis H0 of §2.3.5, that a well-made gamified FRA will be accepted and used, and that failure will not drive abandonment. Step two: the data reject H0 — retrospectively in Stage 1 (Chapter 4) and prospectively in Stage 2 (Chapter 5), where seventy per cent of participants disengaged early and none returned, despite an AI-assisted build that satisfied the stack's design criteria. Step three: self-efficacy explains the dropout but not its permanence, and not the improvement/non-return paradox. Step four: the behavioural-economics account structured in Table 2.1 — loss aversion, identity-relevant endowment, mental accounting, stereotype threat — is assembled to explain precisely the class of observations H0 cannot; the construct itself is named and specified in Chapter 5. Step five: the account implies a design response whose centre is adaptive learning — challenge calibrated to the individual and failure reframed as information about a personal trajectory (§2.6.2A–B) — the behavioural-change driver this programme regards as its principal design discovery. Two components support it: participant-facing decoupling, for which Stage 3 (Chapter 6) provides between-cohort field evidence, and zero-failure presentation, the observation-driven inversion of Octalysis D8 (§2.6.2C). The adaptive-learning framework (Chapter 7) is the engineering formalisation of the adaptive-learning proposition, and it awaits prospective testing.</w:t>
       </w:r>
     </w:p>
     <w:p>

</xml_diff>

<commit_message>
V37: reposition expert panel as §6.12 in timeline order; add Table 3.1A programme timeline
- Retitle §6.8A to scope it to the first interpretive consultation (Dr Yuan)
- Move the four-consultation panel analysis to new §6.12 (after 6.11),
  closing Chapter 6 in calendar order (March-August 2026)
- Insert Table 3.1A programme timeline after Figure 3.1 (nine evidence
  activities, July 2024 - October 2026; yellow author-input cells for
  Stage-2 exact dates and the Stage 3B window)
- Fix numbering collision (new section initially minted as 6.10) and
  point Table 3.1A's 'Reported in' cell at §6.12
- PENDING_ITEMS: ToC-refresh note extended to the new headings/table

Co-Authored-By: Claude Fable 5 <noreply@anthropic.com>
Claude-Session: https://claude.ai/code/session_01KoT3i8geZspYBMMKVYJUTG
</commit_message>
<xml_diff>
--- a/docs/thesis/Full_version_V37_REVIEW_EngD_Thesis_Submission_Draft.docx
+++ b/docs/thesis/Full_version_V37_REVIEW_EngD_Thesis_Submission_Draft.docx
@@ -5116,6 +5116,358 @@
           <w:sz w:val="20"/>
         </w:rPr>
         <w:t>26</w:t>
+      </w:r>
+    </w:p>
+    <w:tbl>
+      <w:tblPr>
+        <w:tblStyle w:val="TableGrid"/>
+        <w:tblW w:type="auto" w:w="0"/>
+        <w:tblLook w:firstColumn="1" w:firstRow="1" w:lastColumn="0" w:lastRow="0" w:noHBand="0" w:noVBand="1" w:val="04A0"/>
+      </w:tblPr>
+      <w:tblGrid>
+        <w:gridCol w:w="2835"/>
+        <w:gridCol w:w="2835"/>
+        <w:gridCol w:w="2835"/>
+      </w:tblGrid>
+      <w:tr>
+        <w:tc>
+          <w:tcPr>
+            <w:tcW w:type="dxa" w:w="2835"/>
+          </w:tcPr>
+          <w:p>
+            <w:r>
+              <w:rPr>
+                <w:b/>
+              </w:rPr>
+              <w:t>Activity</w:t>
+            </w:r>
+          </w:p>
+        </w:tc>
+        <w:tc>
+          <w:tcPr>
+            <w:tcW w:type="dxa" w:w="2835"/>
+          </w:tcPr>
+          <w:p>
+            <w:r>
+              <w:rPr>
+                <w:b/>
+              </w:rPr>
+              <w:t>Period</w:t>
+            </w:r>
+          </w:p>
+        </w:tc>
+        <w:tc>
+          <w:tcPr>
+            <w:tcW w:type="dxa" w:w="2835"/>
+          </w:tcPr>
+          <w:p>
+            <w:r>
+              <w:rPr>
+                <w:b/>
+              </w:rPr>
+              <w:t>Reported in</w:t>
+            </w:r>
+          </w:p>
+        </w:tc>
+      </w:tr>
+      <w:tr>
+        <w:tc>
+          <w:tcPr>
+            <w:tcW w:type="dxa" w:w="2835"/>
+          </w:tcPr>
+          <w:p>
+            <w:r>
+              <w:t>Site observation and the FIDS conjecture</w:t>
+            </w:r>
+          </w:p>
+        </w:tc>
+        <w:tc>
+          <w:tcPr>
+            <w:tcW w:type="dxa" w:w="2835"/>
+          </w:tcPr>
+          <w:p>
+            <w:r>
+              <w:t>2023</w:t>
+            </w:r>
+          </w:p>
+        </w:tc>
+        <w:tc>
+          <w:tcPr>
+            <w:tcW w:type="dxa" w:w="2835"/>
+          </w:tcPr>
+          <w:p>
+            <w:r>
+              <w:t>Chapter 1</w:t>
+            </w:r>
+          </w:p>
+        </w:tc>
+      </w:tr>
+      <w:tr>
+        <w:tc>
+          <w:tcPr>
+            <w:tcW w:type="dxa" w:w="2835"/>
+          </w:tcPr>
+          <w:p>
+            <w:r>
+              <w:t>Stage 1 — retrospective survey (N=200 of 280)</w:t>
+            </w:r>
+          </w:p>
+        </w:tc>
+        <w:tc>
+          <w:tcPr>
+            <w:tcW w:type="dxa" w:w="2835"/>
+          </w:tcPr>
+          <w:p>
+            <w:r>
+              <w:t>July–August 2024</w:t>
+            </w:r>
+          </w:p>
+        </w:tc>
+        <w:tc>
+          <w:tcPr>
+            <w:tcW w:type="dxa" w:w="2835"/>
+          </w:tcPr>
+          <w:p>
+            <w:r>
+              <w:t>Chapter 4</w:t>
+            </w:r>
+          </w:p>
+        </w:tc>
+      </w:tr>
+      <w:tr>
+        <w:tc>
+          <w:tcPr>
+            <w:tcW w:type="dxa" w:w="2835"/>
+          </w:tcPr>
+          <w:p>
+            <w:r>
+              <w:t>Game design and platform validation</w:t>
+            </w:r>
+          </w:p>
+        </w:tc>
+        <w:tc>
+          <w:tcPr>
+            <w:tcW w:type="dxa" w:w="2835"/>
+          </w:tcPr>
+          <w:p>
+            <w:r>
+              <w:t>2024</w:t>
+            </w:r>
+          </w:p>
+        </w:tc>
+        <w:tc>
+          <w:tcPr>
+            <w:tcW w:type="dxa" w:w="2835"/>
+          </w:tcPr>
+          <w:p>
+            <w:r>
+              <w:t>Chapter 5, Appendix G.8</w:t>
+            </w:r>
+          </w:p>
+        </w:tc>
+      </w:tr>
+      <w:tr>
+        <w:tc>
+          <w:tcPr>
+            <w:tcW w:type="dxa" w:w="2835"/>
+          </w:tcPr>
+          <w:p>
+            <w:r>
+              <w:t>Stage 2 — eight-week facility deployment (N=30)</w:t>
+            </w:r>
+          </w:p>
+        </w:tc>
+        <w:tc>
+          <w:tcPr>
+            <w:tcW w:type="dxa" w:w="2835"/>
+          </w:tcPr>
+          <w:p>
+            <w:r>
+              <w:rPr>
+                <w:highlight w:val="yellow"/>
+              </w:rPr>
+              <w:t>[AUTHOR INPUT NEEDED: exact dates]</w:t>
+            </w:r>
+          </w:p>
+        </w:tc>
+        <w:tc>
+          <w:tcPr>
+            <w:tcW w:type="dxa" w:w="2835"/>
+          </w:tcPr>
+          <w:p>
+            <w:r>
+              <w:t>Chapter 5</w:t>
+            </w:r>
+          </w:p>
+        </w:tc>
+      </w:tr>
+      <w:tr>
+        <w:tc>
+          <w:tcPr>
+            <w:tcW w:type="dxa" w:w="2835"/>
+          </w:tcPr>
+          <w:p>
+            <w:r>
+              <w:t>Stage 3 — remote decoupled deployment (register N=120)</w:t>
+            </w:r>
+          </w:p>
+        </w:tc>
+        <w:tc>
+          <w:tcPr>
+            <w:tcW w:type="dxa" w:w="2835"/>
+          </w:tcPr>
+          <w:p>
+            <w:r>
+              <w:t>March–April 2026</w:t>
+            </w:r>
+          </w:p>
+        </w:tc>
+        <w:tc>
+          <w:tcPr>
+            <w:tcW w:type="dxa" w:w="2835"/>
+          </w:tcPr>
+          <w:p>
+            <w:r>
+              <w:t>Chapter 6</w:t>
+            </w:r>
+          </w:p>
+        </w:tc>
+      </w:tr>
+      <w:tr>
+        <w:tc>
+          <w:tcPr>
+            <w:tcW w:type="dxa" w:w="2835"/>
+          </w:tcPr>
+          <w:p>
+            <w:r>
+              <w:t>Expert consultation panel (four consultations + follow-ups)</w:t>
+            </w:r>
+          </w:p>
+        </w:tc>
+        <w:tc>
+          <w:tcPr>
+            <w:tcW w:type="dxa" w:w="2835"/>
+          </w:tcPr>
+          <w:p>
+            <w:r>
+              <w:t>March–August 2026</w:t>
+            </w:r>
+          </w:p>
+        </w:tc>
+        <w:tc>
+          <w:tcPr>
+            <w:tcW w:type="dxa" w:w="2835"/>
+          </w:tcPr>
+          <w:p>
+            <w:r>
+              <w:t>§6.12, Appendix H</w:t>
+            </w:r>
+          </w:p>
+        </w:tc>
+      </w:tr>
+      <w:tr>
+        <w:tc>
+          <w:tcPr>
+            <w:tcW w:type="dxa" w:w="2835"/>
+          </w:tcPr>
+          <w:p>
+            <w:r>
+              <w:t>Ethics approval HSEARS20260805008</w:t>
+            </w:r>
+          </w:p>
+        </w:tc>
+        <w:tc>
+          <w:tcPr>
+            <w:tcW w:type="dxa" w:w="2835"/>
+          </w:tcPr>
+          <w:p>
+            <w:r>
+              <w:t>August 2026</w:t>
+            </w:r>
+          </w:p>
+        </w:tc>
+        <w:tc>
+          <w:tcPr>
+            <w:tcW w:type="dxa" w:w="2835"/>
+          </w:tcPr>
+          <w:p>
+            <w:r>
+              <w:t>§3.4</w:t>
+            </w:r>
+          </w:p>
+        </w:tc>
+      </w:tr>
+      <w:tr>
+        <w:tc>
+          <w:tcPr>
+            <w:tcW w:type="dxa" w:w="2835"/>
+          </w:tcPr>
+          <w:p>
+            <w:r>
+              <w:t>Stage 3B — pre-registered 2x2 field experiment</w:t>
+            </w:r>
+          </w:p>
+        </w:tc>
+        <w:tc>
+          <w:tcPr>
+            <w:tcW w:type="dxa" w:w="2835"/>
+          </w:tcPr>
+          <w:p>
+            <w:r>
+              <w:rPr>
+                <w:highlight w:val="yellow"/>
+              </w:rPr>
+              <w:t>August–October 2026 [AUTHOR INPUT NEEDED: window dates]</w:t>
+            </w:r>
+          </w:p>
+        </w:tc>
+        <w:tc>
+          <w:tcPr>
+            <w:tcW w:type="dxa" w:w="2835"/>
+          </w:tcPr>
+          <w:p>
+            <w:r>
+              <w:t>§8.8</w:t>
+            </w:r>
+          </w:p>
+        </w:tc>
+      </w:tr>
+      <w:tr>
+        <w:tc>
+          <w:tcPr>
+            <w:tcW w:type="dxa" w:w="2835"/>
+          </w:tcPr>
+          <w:p>
+            <w:r>
+              <w:t>Programme close and thesis completion</w:t>
+            </w:r>
+          </w:p>
+        </w:tc>
+        <w:tc>
+          <w:tcPr>
+            <w:tcW w:type="dxa" w:w="2835"/>
+          </w:tcPr>
+          <w:p>
+            <w:r>
+              <w:t>October 2026</w:t>
+            </w:r>
+          </w:p>
+        </w:tc>
+        <w:tc>
+          <w:tcPr>
+            <w:tcW w:type="dxa" w:w="2835"/>
+          </w:tcPr>
+          <w:p>
+            <w:r>
+              <w:t>Chapter 9</w:t>
+            </w:r>
+          </w:p>
+        </w:tc>
+      </w:tr>
+    </w:tbl>
+    <w:p>
+      <w:r>
+        <w:t>Table 3.1A. Programme timeline: evidence activities in calendar order, July 2024 – October 2026, with the chapter that reports each. The research programme closes in October 2026.</w:t>
       </w:r>
     </w:p>
     <w:p>
@@ -18154,7 +18506,7 @@
           <w:sz w:val="24"/>
           <w:szCs w:val="22"/>
         </w:rPr>
-        <w:t>6.8A The Commitment Gap Read Through Group Dynamics: An Expert Consultation</w:t>
+        <w:t>6.8A The Commitment Gap Read Through Group Dynamics: The First Interpretive Consultation (Dr Yuan)</w:t>
       </w:r>
     </w:p>
     <w:p>
@@ -18169,34 +18521,6 @@
           <w:sz w:val="24"/>
         </w:rPr>
         <w:t>The interpretation of the commitment gap was examined after the empirical programme through expert consultation, beginning with Dr Sarah C.W. Yuan of the Center on the Family, University of Hawai'i at Mānoa — a medical sociologist and demographer of aging whose work includes the Hawai'i Healthy Aging Partnership and statewide community falls-prevention programming. Her field of practice is deliberately distant from this programme's apparatus: group exercise and physical games for balance, with no electronic game and no clinical instrument attached to the activity. The consultation is reported as interpretive evidence from an independent discipline, not as additional participant data; the record is the author's structured notes, reproduced in Appendix H.</w:t>
-      </w:r>
-    </w:p>
-    <w:p>
-      <w:r>
-        <w:t>Three further consultations extend the validation across clinical-practice standpoints; their full records are in Appendix H.6-H.8, and the analysis below reports convergence, divergence and silence rather than agreement alone. Dr Philip Choy, drawing on a caseload of more than a thousand elderly chronic-disease patients, was asked the programme's definitional question directly - is the operative failure the game's, or the health result's? He agreed that the game itself does not cause the abandonment syndrome: it arises mainly from users' concerns about their own health performance, a pattern he described as very common among elderly people who have acknowledged a principal health condition. This is an independent, practice-based statement of the attribution claim at the centre of this thesis. He further located the adopting demographic - educated, financially independent adults from roughly 65-70 upward, engaging only once a concrete benefit is identified - and judged token reward economies insufficient for that segment.</w:t>
-      </w:r>
-    </w:p>
-    <w:p>
-      <w:r>
-        <w:t>Expert P, the panel's physiotherapist, contributed an abandonment window of two weeks to two months from post-surgical rehabilitation caseloads - an adjacent, clinically supervised population, cited here as analogy rather than corroboration of the FRA timing - together with three design observations: some assessments (balance, fall risk, cognition) cannot be simplified, supporting the occupied-middle argument of Figure 8.1; games pitched too simply read as childish to older players; and, most distinctively, that higher-educated patients who are observed failing will probably stop immediately - failure witnessed is a stronger stopping trigger than failure alone, which retrospectively supports Stage 3's choice of private, unsupervised play. In a dated follow-up he played the decoupled build itself and judged it suitable for fall-risk assessment, stating he would return to it regularly were it installed - the panel's first artifact-level validation, mirroring the study's intention construct behaviourally.</w:t>
-      </w:r>
-    </w:p>
-    <w:p>
-      <w:r>
-        <w:t>Dr Gary Lau's consultation bears on the framework's costliest element: coaching. In his account, coaching is always the best and most direct approach to sustaining rehabilitation - and it cannot scale: family involvement carries too high a social cost, and professional therapist resources are scarce. That pair of statements is the clinical case for the framework's coaching layer, and for AI's enabling role as the affordable way to give every user a coach. His diagnosis that current health technology offers no progressive, positive signs across a long, boring and lonely journey grounds the visible-trajectory element; and his stated position that technology should be embraced but not over-relied upon - care remaining people-centred - independently states the boundary this thesis draws for AI.</w:t>
-      </w:r>
-    </w:p>
-    <w:p>
-      <w:r>
-        <w:rPr>
-          <w:highlight w:val="yellow"/>
-        </w:rPr>
-        <w:t>[AUTHOR INPUT NEEDED - Dr Lau second consultation: his played-the-game feedback and the Mirror-project convergence (avatar coaching; self-awareness and self-engagement as the key mechanism) await his explicit clearance and the author's record before this paragraph is completed.]</w:t>
-      </w:r>
-    </w:p>
-    <w:p>
-      <w:r>
-        <w:t>The analysis records its own limits. The verdict-attribution corroboration rests on Dr Choy alone - the question was not put to the other experts. Dr Choy's and Expert P's observations share a private-practice sampling frame, and their convergence on the adopter demographic is weighted accordingly. Expert P's abandonment window derives from medically necessary, supervised rehabilitation rather than voluntary preventive assessment. And Dr Lau's honest uncertainty - whether games can change patients' minds and behaviour, he cannot yet be sure - is reported as his position, not resolved away. Expert views contextualise the behavioural evidence; they are not evidence for the hypotheses.</w:t>
       </w:r>
     </w:p>
     <w:p>
@@ -20094,6 +20418,47 @@
           <w:szCs w:val="28"/>
         </w:rPr>
         <w:br w:type="page"/>
+      </w:r>
+    </w:p>
+    <w:p>
+      <w:pPr>
+        <w:pStyle w:val="Heading2"/>
+      </w:pPr>
+      <w:r>
+        <w:t>6.12 The Expert Consultation Panel (March–August 2026)</w:t>
+      </w:r>
+    </w:p>
+    <w:p>
+      <w:r>
+        <w:t>The programme's fourth evidence activity closed its empirical arc in calendar order: after the Stage-3 window, the findings of all three stages were taken to a panel of four senior practitioners and researchers between March and August 2026, under the method, consent and analysis arrangements described in §3.2 (records: Appendix H.1-H.8). Dr Yuan's commitment-gap consultation is reported at §6.8A above; the panel-wide analysis follows here, reported as convergence, divergence and silence.</w:t>
+      </w:r>
+    </w:p>
+    <w:p>
+      <w:r>
+        <w:t>Three further consultations extend the validation across clinical-practice standpoints; their full records are in Appendix H.6-H.8, and the analysis below reports convergence, divergence and silence rather than agreement alone. Dr Philip Choy, drawing on a caseload of more than a thousand elderly chronic-disease patients, was asked the programme's definitional question directly - is the operative failure the game's, or the health result's? He agreed that the game itself does not cause the abandonment syndrome: it arises mainly from users' concerns about their own health performance, a pattern he described as very common among elderly people who have acknowledged a principal health condition. This is an independent, practice-based statement of the attribution claim at the centre of this thesis. He further located the adopting demographic - educated, financially independent adults from roughly 65-70 upward, engaging only once a concrete benefit is identified - and judged token reward economies insufficient for that segment.</w:t>
+      </w:r>
+    </w:p>
+    <w:p>
+      <w:r>
+        <w:t>Expert P, the panel's physiotherapist, contributed an abandonment window of two weeks to two months from post-surgical rehabilitation caseloads - an adjacent, clinically supervised population, cited here as analogy rather than corroboration of the FRA timing - together with three design observations: some assessments (balance, fall risk, cognition) cannot be simplified, supporting the occupied-middle argument of Figure 8.1; games pitched too simply read as childish to older players; and, most distinctively, that higher-educated patients who are observed failing will probably stop immediately - failure witnessed is a stronger stopping trigger than failure alone, which retrospectively supports Stage 3's choice of private, unsupervised play. In a dated follow-up he played the decoupled build itself and judged it suitable for fall-risk assessment, stating he would return to it regularly were it installed - the panel's first artifact-level validation, mirroring the study's intention construct behaviourally.</w:t>
+      </w:r>
+    </w:p>
+    <w:p>
+      <w:r>
+        <w:t>Dr Gary Lau's consultation bears on the framework's costliest element: coaching. In his account, coaching is always the best and most direct approach to sustaining rehabilitation - and it cannot scale: family involvement carries too high a social cost, and professional therapist resources are scarce. That pair of statements is the clinical case for the framework's coaching layer, and for AI's enabling role as the affordable way to give every user a coach. His diagnosis that current health technology offers no progressive, positive signs across a long, boring and lonely journey grounds the visible-trajectory element; and his stated position that technology should be embraced but not over-relied upon - care remaining people-centred - independently states the boundary this thesis draws for AI.</w:t>
+      </w:r>
+    </w:p>
+    <w:p>
+      <w:r>
+        <w:rPr>
+          <w:highlight w:val="yellow"/>
+        </w:rPr>
+        <w:t>[AUTHOR INPUT NEEDED - Dr Lau second consultation: his played-the-game feedback and the Mirror-project convergence (avatar coaching; self-awareness and self-engagement as the key mechanism) await his explicit clearance and the author's record before this paragraph is completed.]</w:t>
+      </w:r>
+    </w:p>
+    <w:p>
+      <w:r>
+        <w:t>The analysis records its own limits. The verdict-attribution corroboration rests on Dr Choy alone - the question was not put to the other experts. Dr Choy's and Expert P's observations share a private-practice sampling frame, and their convergence on the adopter demographic is weighted accordingly. Expert P's abandonment window derives from medically necessary, supervised rehabilitation rather than voluntary preventive assessment. And Dr Lau's honest uncertainty - whether games can change patients' minds and behaviour, he cannot yet be sure - is reported as his position, not resolved away. Expert views contextualise the behavioural evidence; they are not evidence for the hypotheses.</w:t>
       </w:r>
     </w:p>
     <w:p>

</xml_diff>

<commit_message>
V37: add §9.2A programme diary with Table 9.1 knowledge-evolution table
- New §9.2A after §9.2: the research journey as a calendar-ordered diary
- Table 9.1 (5 columns: period / activity / knowledge going in / what was
  produced / what was revised or nullified), 2023 - October 2026
- Records the nullification arc: non-exposure account, competence account,
  dispositional H0, and AI-as-critical each held, tested and given up
- Placed in Chapter 9 (not Chapter 3) so findings appear only
  retrospectively, consistent with the standing writing-logic standard
- Yellow cells: Stage-2 exact dates; Stage 3B window and open outcome cells
- PENDING_ITEMS updated (ToC refresh now includes §9.2A)

Co-Authored-By: Claude Fable 5 <noreply@anthropic.com>
Claude-Session: https://claude.ai/code/session_01KoT3i8geZspYBMMKVYJUTG
</commit_message>
<xml_diff>
--- a/docs/thesis/Full_version_V37_REVIEW_EngD_Thesis_Submission_Draft.docx
+++ b/docs/thesis/Full_version_V37_REVIEW_EngD_Thesis_Submission_Draft.docx
@@ -23844,6 +23844,589 @@
           <w:sz w:val="24"/>
         </w:rPr>
         <w:t>Stage 3 examined a participant-facing decoupling package in a separate Hong Kong cohort of 120 adults recruited through the author's networks, playing an e-mailed HTML port of the game on their own computers. The skiing-game structure was retained in the port; the pressure-panel apparatus, clinical setting and in-person supervision were not, and clinical recruitment language, pre-session procedure, labels and participant-facing outputs were changed. Observed non-return was 6.7% overall and 14.6% in the 65-80 band. Fifteen of twenty-three initial dropouts returned overall; ten of sixteen returned in the 65-80 band. The result is a substantial behavioural difference and supports a frame-sensitive account, but the between-cohort design does not eliminate cohort and contextual alternatives. Coordination endorsement is interpreted as a manipulation check, not as a direct measure of latent learning orientation.</w:t>
+      </w:r>
+    </w:p>
+    <w:p>
+      <w:pPr>
+        <w:pStyle w:val="Heading2"/>
+      </w:pPr>
+      <w:r>
+        <w:t>9.2A The Programme Diary: How the Knowledge Evolved and What Was Nullified</w:t>
+      </w:r>
+    </w:p>
+    <w:p>
+      <w:pPr/>
+      <w:r>
+        <w:t>The three-stage narrative above can also be read as a diary. Table 9.1 sets the programme's evidence activities in strict calendar order and records, for each entry, the knowledge position the author held going in, what the activity produced, and what was revised or nullified as a result. The table is deliberately retrospective: each chapter of this thesis reports only what existed at that point in the journey (Table 3.1A gives the activity calendar without findings), so this is the first place the full evolution can be stated in one view. The discipline the diary makes visible is that the programme advanced by nullification as much as by confirmation - the simple non-exposure account, the competence account, the dispositional account, and the assumption that artificial intelligence was critical rather than enabling were each held, tested and given up in turn.</w:t>
+      </w:r>
+    </w:p>
+    <w:tbl>
+      <w:tblPr>
+        <w:tblStyle w:val="TableGrid"/>
+        <w:tblW w:type="auto" w:w="0"/>
+        <w:tblLook w:firstColumn="1" w:firstRow="1" w:lastColumn="0" w:lastRow="0" w:noHBand="0" w:noVBand="1" w:val="04A0"/>
+      </w:tblPr>
+      <w:tblGrid>
+        <w:gridCol w:w="1701"/>
+        <w:gridCol w:w="1701"/>
+        <w:gridCol w:w="1701"/>
+        <w:gridCol w:w="1701"/>
+        <w:gridCol w:w="1701"/>
+      </w:tblGrid>
+      <w:tr>
+        <w:tc>
+          <w:tcPr>
+            <w:tcW w:type="dxa" w:w="1701"/>
+          </w:tcPr>
+          <w:p>
+            <w:r>
+              <w:rPr>
+                <w:b/>
+              </w:rPr>
+              <w:t>Period</w:t>
+            </w:r>
+          </w:p>
+        </w:tc>
+        <w:tc>
+          <w:tcPr>
+            <w:tcW w:type="dxa" w:w="1701"/>
+          </w:tcPr>
+          <w:p>
+            <w:r>
+              <w:rPr>
+                <w:b/>
+              </w:rPr>
+              <w:t>Activity</w:t>
+            </w:r>
+          </w:p>
+        </w:tc>
+        <w:tc>
+          <w:tcPr>
+            <w:tcW w:type="dxa" w:w="1701"/>
+          </w:tcPr>
+          <w:p>
+            <w:r>
+              <w:rPr>
+                <w:b/>
+              </w:rPr>
+              <w:t>Knowledge position going in</w:t>
+            </w:r>
+          </w:p>
+        </w:tc>
+        <w:tc>
+          <w:tcPr>
+            <w:tcW w:type="dxa" w:w="1701"/>
+          </w:tcPr>
+          <w:p>
+            <w:r>
+              <w:rPr>
+                <w:b/>
+              </w:rPr>
+              <w:t>What the activity produced</w:t>
+            </w:r>
+          </w:p>
+        </w:tc>
+        <w:tc>
+          <w:tcPr>
+            <w:tcW w:type="dxa" w:w="1701"/>
+          </w:tcPr>
+          <w:p>
+            <w:r>
+              <w:rPr>
+                <w:b/>
+              </w:rPr>
+              <w:t>What was revised or nullified</w:t>
+            </w:r>
+          </w:p>
+        </w:tc>
+      </w:tr>
+      <w:tr>
+        <w:tc>
+          <w:tcPr>
+            <w:tcW w:type="dxa" w:w="1701"/>
+          </w:tcPr>
+          <w:p>
+            <w:r>
+              <w:t>2023</w:t>
+            </w:r>
+          </w:p>
+        </w:tc>
+        <w:tc>
+          <w:tcPr>
+            <w:tcW w:type="dxa" w:w="1701"/>
+          </w:tcPr>
+          <w:p>
+            <w:r>
+              <w:t>Site observation at the operating facility</w:t>
+            </w:r>
+          </w:p>
+        </w:tc>
+        <w:tc>
+          <w:tcPr>
+            <w:tcW w:type="dxa" w:w="1701"/>
+          </w:tcPr>
+          <w:p>
+            <w:r>
+              <w:t>Industry experience of FRA operations; abandonment literature</w:t>
+            </w:r>
+          </w:p>
+        </w:tc>
+        <w:tc>
+          <w:tcPr>
+            <w:tcW w:type="dxa" w:w="1701"/>
+          </w:tcPr>
+          <w:p>
+            <w:r>
+              <w:t>The FIDS conjecture: device-associated discomfort as a candidate driver of non-return</w:t>
+            </w:r>
+          </w:p>
+        </w:tc>
+        <w:tc>
+          <w:tcPr>
+            <w:tcW w:type="dxa" w:w="1701"/>
+          </w:tcPr>
+          <w:p>
+            <w:r>
+              <w:t>- (starting conjecture recorded)</w:t>
+            </w:r>
+          </w:p>
+        </w:tc>
+      </w:tr>
+      <w:tr>
+        <w:tc>
+          <w:tcPr>
+            <w:tcW w:type="dxa" w:w="1701"/>
+          </w:tcPr>
+          <w:p>
+            <w:r>
+              <w:t>July-August 2024</w:t>
+            </w:r>
+          </w:p>
+        </w:tc>
+        <w:tc>
+          <w:tcPr>
+            <w:tcW w:type="dxa" w:w="1701"/>
+          </w:tcPr>
+          <w:p>
+            <w:r>
+              <w:t>Stage 1 retrospective survey (N=200 of 280)</w:t>
+            </w:r>
+          </w:p>
+        </w:tc>
+        <w:tc>
+          <w:tcPr>
+            <w:tcW w:type="dxa" w:w="1701"/>
+          </w:tcPr>
+          <w:p>
+            <w:r>
+              <w:t>FIDS conjecture</w:t>
+            </w:r>
+          </w:p>
+        </w:tc>
+        <w:tc>
+          <w:tcPr>
+            <w:tcW w:type="dxa" w:w="1701"/>
+          </w:tcPr>
+          <w:p>
+            <w:r>
+              <w:t>The utilisation/non-return problem quantified; adverse device experience concentrated among prior users</w:t>
+            </w:r>
+          </w:p>
+        </w:tc>
+        <w:tc>
+          <w:tcPr>
+            <w:tcW w:type="dxa" w:w="1701"/>
+          </w:tcPr>
+          <w:p>
+            <w:r>
+              <w:t>Simple non-exposure account nullified: non-return was driven by prior users, not by residents who had never encountered the device</w:t>
+            </w:r>
+          </w:p>
+        </w:tc>
+      </w:tr>
+      <w:tr>
+        <w:tc>
+          <w:tcPr>
+            <w:tcW w:type="dxa" w:w="1701"/>
+          </w:tcPr>
+          <w:p>
+            <w:r>
+              <w:t>2024</w:t>
+            </w:r>
+          </w:p>
+        </w:tc>
+        <w:tc>
+          <w:tcPr>
+            <w:tcW w:type="dxa" w:w="1701"/>
+          </w:tcPr>
+          <w:p>
+            <w:r>
+              <w:t>Game design and platform validation</w:t>
+            </w:r>
+          </w:p>
+        </w:tc>
+        <w:tc>
+          <w:tcPr>
+            <w:tcW w:type="dxa" w:w="1701"/>
+          </w:tcPr>
+          <w:p>
+            <w:r>
+              <w:t>Gamification and dynamic-difficulty literature</w:t>
+            </w:r>
+          </w:p>
+        </w:tc>
+        <w:tc>
+          <w:tcPr>
+            <w:tcW w:type="dxa" w:w="1701"/>
+          </w:tcPr>
+          <w:p>
+            <w:r>
+              <w:t>The dual-purpose AI-assisted skiing game as the programme's instrument</w:t>
+            </w:r>
+          </w:p>
+        </w:tc>
+        <w:tc>
+          <w:tcPr>
+            <w:tcW w:type="dxa" w:w="1701"/>
+          </w:tcPr>
+          <w:p>
+            <w:r>
+              <w:t>-</w:t>
+            </w:r>
+          </w:p>
+        </w:tc>
+      </w:tr>
+      <w:tr>
+        <w:tc>
+          <w:tcPr>
+            <w:tcW w:type="dxa" w:w="1701"/>
+          </w:tcPr>
+          <w:p>
+            <w:r>
+              <w:rPr>
+                <w:highlight w:val="yellow"/>
+              </w:rPr>
+              <w:t>[AUTHOR INPUT NEEDED: exact dates]</w:t>
+            </w:r>
+          </w:p>
+        </w:tc>
+        <w:tc>
+          <w:tcPr>
+            <w:tcW w:type="dxa" w:w="1701"/>
+          </w:tcPr>
+          <w:p>
+            <w:r>
+              <w:t>Stage 2 eight-week facility deployment (N=30)</w:t>
+            </w:r>
+          </w:p>
+        </w:tc>
+        <w:tc>
+          <w:tcPr>
+            <w:tcW w:type="dxa" w:w="1701"/>
+          </w:tcPr>
+          <w:p>
+            <w:r>
+              <w:t>Expectation that gamified delivery would sustain engagement</w:t>
+            </w:r>
+          </w:p>
+        </w:tc>
+        <w:tc>
+          <w:tcPr>
+            <w:tcW w:type="dxa" w:w="1701"/>
+          </w:tcPr>
+          <w:p>
+            <w:r>
+              <w:t>Seventy per cent disengagement at or before three cycles; the objective-score-improvement/non-return paradox</w:t>
+            </w:r>
+          </w:p>
+        </w:tc>
+        <w:tc>
+          <w:tcPr>
+            <w:tcW w:type="dxa" w:w="1701"/>
+          </w:tcPr>
+          <w:p>
+            <w:r>
+              <w:t>Competence account nullified (scores improved yet players did not return); FIDS alone could no longer carry the account - the transition to FIAS, specified in Chapter 5, is the pivotal move of the research journey</w:t>
+            </w:r>
+          </w:p>
+        </w:tc>
+      </w:tr>
+      <w:tr>
+        <w:tc>
+          <w:tcPr>
+            <w:tcW w:type="dxa" w:w="1701"/>
+          </w:tcPr>
+          <w:p>
+            <w:r>
+              <w:t>March-April 2026</w:t>
+            </w:r>
+          </w:p>
+        </w:tc>
+        <w:tc>
+          <w:tcPr>
+            <w:tcW w:type="dxa" w:w="1701"/>
+          </w:tcPr>
+          <w:p>
+            <w:r>
+              <w:t>Stage 3 remote decoupled deployment (register N=120)</w:t>
+            </w:r>
+          </w:p>
+        </w:tc>
+        <w:tc>
+          <w:tcPr>
+            <w:tcW w:type="dxa" w:w="1701"/>
+          </w:tcPr>
+          <w:p>
+            <w:r>
+              <w:t>FIAS as the candidate account; frame-sensitive and dispositional readings as rivals</w:t>
+            </w:r>
+          </w:p>
+        </w:tc>
+        <w:tc>
+          <w:tcPr>
+            <w:tcW w:type="dxa" w:w="1701"/>
+          </w:tcPr>
+          <w:p>
+            <w:r>
+              <w:t>A substantial behavioural shift once the assessment frame was removed; the commitment gap</w:t>
+            </w:r>
+          </w:p>
+        </w:tc>
+        <w:tc>
+          <w:tcPr>
+            <w:tcW w:type="dxa" w:w="1701"/>
+          </w:tcPr>
+          <w:p>
+            <w:r>
+              <w:t>The dispositional account (H0) could not accommodate the between-cohort shift; frame-sensitivity retained as the calibrated reading</w:t>
+            </w:r>
+          </w:p>
+        </w:tc>
+      </w:tr>
+      <w:tr>
+        <w:tc>
+          <w:tcPr>
+            <w:tcW w:type="dxa" w:w="1701"/>
+          </w:tcPr>
+          <w:p>
+            <w:r>
+              <w:t>March-August 2026</w:t>
+            </w:r>
+          </w:p>
+        </w:tc>
+        <w:tc>
+          <w:tcPr>
+            <w:tcW w:type="dxa" w:w="1701"/>
+          </w:tcPr>
+          <w:p>
+            <w:r>
+              <w:t>Expert consultation panel (four consultations with follow-ups)</w:t>
+            </w:r>
+          </w:p>
+        </w:tc>
+        <w:tc>
+          <w:tcPr>
+            <w:tcW w:type="dxa" w:w="1701"/>
+          </w:tcPr>
+          <w:p>
+            <w:r>
+              <w:t>Stage 1-3 findings and the FIDS-to-FIAS transition</w:t>
+            </w:r>
+          </w:p>
+        </w:tc>
+        <w:tc>
+          <w:tcPr>
+            <w:tcW w:type="dxa" w:w="1701"/>
+          </w:tcPr>
+          <w:p>
+            <w:r>
+              <w:t>Clinical corroboration of the abandonment window, verdict attribution and reward economics; the build judged suitable for FRA practice</w:t>
+            </w:r>
+          </w:p>
+        </w:tc>
+        <w:tc>
+          <w:tcPr>
+            <w:tcW w:type="dxa" w:w="1701"/>
+          </w:tcPr>
+          <w:p>
+            <w:r>
+              <w:t>Technology-difficulty as the primary barrier was challenged from practice; coaching-at-scale was revised on cost grounds (social cost and therapist scarcity)</w:t>
+            </w:r>
+          </w:p>
+        </w:tc>
+      </w:tr>
+      <w:tr>
+        <w:tc>
+          <w:tcPr>
+            <w:tcW w:type="dxa" w:w="1701"/>
+          </w:tcPr>
+          <w:p>
+            <w:r>
+              <w:t>August 2026</w:t>
+            </w:r>
+          </w:p>
+        </w:tc>
+        <w:tc>
+          <w:tcPr>
+            <w:tcW w:type="dxa" w:w="1701"/>
+          </w:tcPr>
+          <w:p>
+            <w:r>
+              <w:t>Ethics approval HSEARS20260805008</w:t>
+            </w:r>
+          </w:p>
+        </w:tc>
+        <w:tc>
+          <w:tcPr>
+            <w:tcW w:type="dxa" w:w="1701"/>
+          </w:tcPr>
+          <w:p>
+            <w:r>
+              <w:t>-</w:t>
+            </w:r>
+          </w:p>
+        </w:tc>
+        <w:tc>
+          <w:tcPr>
+            <w:tcW w:type="dxa" w:w="1701"/>
+          </w:tcPr>
+          <w:p>
+            <w:r>
+              <w:t>Formal approval covering the programme as conducted and the forward stage</w:t>
+            </w:r>
+          </w:p>
+        </w:tc>
+        <w:tc>
+          <w:tcPr>
+            <w:tcW w:type="dxa" w:w="1701"/>
+          </w:tcPr>
+          <w:p>
+            <w:r>
+              <w:t>-</w:t>
+            </w:r>
+          </w:p>
+        </w:tc>
+      </w:tr>
+      <w:tr>
+        <w:tc>
+          <w:tcPr>
+            <w:tcW w:type="dxa" w:w="1701"/>
+          </w:tcPr>
+          <w:p>
+            <w:r>
+              <w:rPr>
+                <w:highlight w:val="yellow"/>
+              </w:rPr>
+              <w:t>August-October 2026 [AUTHOR INPUT NEEDED: window dates]</w:t>
+            </w:r>
+          </w:p>
+        </w:tc>
+        <w:tc>
+          <w:tcPr>
+            <w:tcW w:type="dxa" w:w="1701"/>
+          </w:tcPr>
+          <w:p>
+            <w:r>
+              <w:t>Stage 3B pre-registered 2x2 field experiment</w:t>
+            </w:r>
+          </w:p>
+        </w:tc>
+        <w:tc>
+          <w:tcPr>
+            <w:tcW w:type="dxa" w:w="1701"/>
+          </w:tcPr>
+          <w:p>
+            <w:r>
+              <w:t>The adaptive-learning framework; the errorless-versus-graceful-failure question open</w:t>
+            </w:r>
+          </w:p>
+        </w:tc>
+        <w:tc>
+          <w:tcPr>
+            <w:tcW w:type="dxa" w:w="1701"/>
+          </w:tcPr>
+          <w:p>
+            <w:r>
+              <w:rPr>
+                <w:highlight w:val="yellow"/>
+              </w:rPr>
+              <w:t>[TO BE REPORTED when the Stage 3B window closes]</w:t>
+            </w:r>
+          </w:p>
+        </w:tc>
+        <w:tc>
+          <w:tcPr>
+            <w:tcW w:type="dxa" w:w="1701"/>
+          </w:tcPr>
+          <w:p>
+            <w:r>
+              <w:rPr>
+                <w:highlight w:val="yellow"/>
+              </w:rPr>
+              <w:t>[OPEN - H-3B under test; the design allows the adaptive-arm advantage itself to be nullified]</w:t>
+            </w:r>
+          </w:p>
+        </w:tc>
+      </w:tr>
+      <w:tr>
+        <w:tc>
+          <w:tcPr>
+            <w:tcW w:type="dxa" w:w="1701"/>
+          </w:tcPr>
+          <w:p>
+            <w:r>
+              <w:t>October 2026</w:t>
+            </w:r>
+          </w:p>
+        </w:tc>
+        <w:tc>
+          <w:tcPr>
+            <w:tcW w:type="dxa" w:w="1701"/>
+          </w:tcPr>
+          <w:p>
+            <w:r>
+              <w:t>Programme close and thesis completion</w:t>
+            </w:r>
+          </w:p>
+        </w:tc>
+        <w:tc>
+          <w:tcPr>
+            <w:tcW w:type="dxa" w:w="1701"/>
+          </w:tcPr>
+          <w:p>
+            <w:r>
+              <w:t>-</w:t>
+            </w:r>
+          </w:p>
+        </w:tc>
+        <w:tc>
+          <w:tcPr>
+            <w:tcW w:type="dxa" w:w="1701"/>
+          </w:tcPr>
+          <w:p>
+            <w:r>
+              <w:t>The calibrated evidential chain: observed, interpreted, demonstrated in part, hypothesised</w:t>
+            </w:r>
+          </w:p>
+        </w:tc>
+        <w:tc>
+          <w:tcPr>
+            <w:tcW w:type="dxa" w:w="1701"/>
+          </w:tcPr>
+          <w:p>
+            <w:r>
+              <w:t>Artificial intelligence recalibrated from critical to enabling - the deterministic rule agent sufficed for in-run adaptation</w:t>
+            </w:r>
+          </w:p>
+        </w:tc>
+      </w:tr>
+    </w:tbl>
+    <w:p>
+      <w:pPr>
+        <w:pStyle w:val="Caption"/>
+      </w:pPr>
+      <w:r>
+        <w:t>Table 9.1. The programme diary: knowledge evolution in calendar order, 2023 - October 2026. Yellow cells await author input or the close of the Stage 3B window.</w:t>
       </w:r>
     </w:p>
     <w:p>

</xml_diff>

<commit_message>
V37: scoring design rationale added to s8.8 Stage 3B instrument account
New paragraph recording the score economy as a design argument:
- why the Stage-2/3 scoring was deliberately thin (glance legibility
  for non-gaming older players; avoiding score salience where salient
  evaluation drives withdrawal)
- the Stage-3B gains-only enrichment in RPG grammar (combo, dodges,
  collection rate, persistent XP/levels)
- the rejected deduction alternative and its loss-aversion grounds
- opportunity-cost vs confiscation mapped to the learning-trajectory
  vs endowment-protective appraisal distinction (s7.3)
- scoring as instrument property (identical across arms), finalised
  pre-launch per protocol Amendment A

Co-Authored-By: Claude Fable 5 <noreply@anthropic.com>
Claude-Session: https://claude.ai/code/session_01KoT3i8geZspYBMMKVYJUTG
</commit_message>
<xml_diff>
--- a/docs/thesis/Full_version_V37_REVIEW_EngD_Thesis_Submission_Draft.docx
+++ b/docs/thesis/Full_version_V37_REVIEW_EngD_Thesis_Submission_Draft.docx
@@ -23372,6 +23372,14 @@
       </w:pPr>
       <w:r>
         <w:t>Since this section was first drafted, the first element of the confirmatory programme has been designed and pre-registered: Stage 3B, a 2x2 field experiment crossing adaptive against static presentation with zero-failure against failure-possible modes, in a new cohort of 80-120 adults recruited in the same three age bands, with recorded in-build consent, a single pre-specified confirmatory contrast, and a trilingual instrument implementing the framework's calibration, trajectory and coaching elements. The design also brings into contact, for older adults in a health-technology context, two traditions the literature has kept apart: errorless learning, which holds that vulnerable learners acquire best when prevented from erring (Baddeley &amp; Wilson, 1994), and the graceful-failure position of game-based learning, which treats low-consequence failure as productive (Plass, Homer, &amp; Kinzer, 2015); dynamic difficulty adjustment supplies the adaptive arm's engineering lineage (Zohaib, 2018).</w:t>
+      </w:r>
+    </w:p>
+    <w:p>
+      <w:pPr>
+        <w:jc w:val="both"/>
+      </w:pPr>
+      <w:r>
+        <w:t>The build's score economy is itself a design argument, and its two generations record a deliberate progression rather than an oversight corrected. The deployed Stage-2 and Stage-3 builds kept scoring intentionally thin - distance plus coins - for two reasons: for largely non-gaming older players the score had to be legible at a single glance, and a rich scoring apparatus makes the score more salient exactly where the programme's evidence warns that salient evaluation drives withdrawal. Once the zero-failure and trajectory findings had matured, the Stage-3B build could afford motivational depth - but enriched the economy on the gain side only, borrowing the grammar of role-playing games, in which experience points never decrease: a clean-riding combo multiplier (x1 to x3) that an obstacle bump resets, skill-dodge bonuses for near misses, a collection rate shown in place of any missed-coin penalty, and a persistent experience total with skier levels that accumulates across a participant's sessions. A deduction-based alternative (for example minus 100 points per hit) was considered and rejected on the programme's own grounds: under loss aversion, subtracting visible points converts each bump into a quantified verdict, re-importing into the scoreboard the loss economy that zero-failure design (§2.6.2C, §5.3.10) exists to remove. In the final economy, failure costs future earning rate - the reset multiplier - but never confiscates banked points; the distinction between opportunity cost and confiscation is the same distinction the framework formalises between learning-trajectory and endowment-protective appraisals (§7.3), now expressed inside the scoreboard itself. The persistent level system serves the sessions-played co-primary outcome directly: it gives a reason to return that does not depend on beating one's own record, because every session adds experience regardless of performance. The scoring formula is identical in both arms and both failure modes - it is an instrument property, not an experimental factor - and was finalised, with the rejected alternative recorded, before any participant played (protocol Amendment A).</w:t>
       </w:r>
     </w:p>
     <w:p>

</xml_diff>

<commit_message>
Input-modality confound: s8.5.8 three-stage extension + build logs Input_Mode
- s8.5.8 extended: Stage 3B touch input added to the modality
  inventory (standing whole-body -> seated hand -> seated touch);
  every confirmatory contrast shown to be internally single-modality
  (paradox within Stage 2, age gradient within Stage 3, 2x2 within
  the touch fleet); within-cohort randomised study holds input
  constant; graduated-embodiment pathway (touch -> seated foot pad ->
  standing panel) framed as the re-attachment design ladder
- Build v3.1: logs the input mode actually used per run (Input_Mode:
  touch/keys/tilt/pad, '+' for mixed) into the session export;
  smoke-tested (keyboard run records 'keys')
- Protocol Amendment B records the logging and the calibration
- DEV1-5 regenerated

Co-Authored-By: Claude Fable 5 <noreply@anthropic.com>
Claude-Session: https://claude.ai/code/session_01KoT3i8geZspYBMMKVYJUTG
</commit_message>
<xml_diff>
--- a/docs/thesis/Full_version_V37_REVIEW_EngD_Thesis_Submission_Draft.docx
+++ b/docs/thesis/Full_version_V37_REVIEW_EngD_Thesis_Submission_Draft.docx
@@ -23003,6 +23003,14 @@
           <w:sz w:val="24"/>
         </w:rPr>
         <w:t>Concern: in Stage 2, failure occurred through the body's own balance — weight shifts on the pressure panel — whereas in Stage 3 most participants steered with a trackpad or arrow keys (§6.3). The difference between the stages may therefore reflect not only the changed participant-facing frame but also the changed carrier of failure: a failure produced by one's own balance may speak more directly to bodily decline than a failure produced by one's fingers. Response: this alternative is viable, and the present between-cohort design does not separate it from the framing account. It is, however, partly absorbed into the coupling account itself, because the bodily measurement pathway is precisely what the dual-purpose mechanic couples to the game (§5.2A): removing the pressure panel removed the clinical frame and the embodied exposure together. The within-cohort study of §8.8 treats the game, the input device and the frame as independently manipulable factors, so that the contributions of framing and of input modality can be estimated separately.</w:t>
+      </w:r>
+    </w:p>
+    <w:p>
+      <w:pPr>
+        <w:jc w:val="both"/>
+      </w:pPr>
+      <w:r>
+        <w:t>Stage 3B extends the modality inventory a third step - iPad touch steering (on-screen arrows, with keyboard, controller and tilt as alternatives, and the input mode actually used logged per run in the session record) - so the programme now spans standing whole-body input (Stage 2), seated hand input (Stage 3) and seated touch input (Stage 3B). Three points keep this from contaminating the inferences. First, every confirmatory contrast is internally single-modality: the score-improvement/non-return paradox arose entirely within the Stage-2 panel cohort, the age gradient entirely within the Stage-3 remote cohort, and the Stage-3B 2x2 contrasts (adaptive against static, zero-failure against failure-possible) are randomised within one touch-input fleet - so input modality attaches only to the between-stage comparisons, which are already calibrated as non-causal (§6.7). Second, the randomised within-cohort study specified above holds hardware, software and input device constant across arms, which is the design that finally separates frame from modality. Third, the gradient itself is theoretically informative rather than mere noise: if failure produced by one's own balance speaks more directly to bodily decline than failure produced by one's fingers, then input modality is an identity-exposure dial, and the framework can use it as one - a graduated-embodiment pathway in which engagement begins at the lowest-stake modality (touch), moves through seated foot-pad play, and only then returns to the standing panel, letting confidence accumulate before the body itself is back on trial. On that reading, the modality differences across the programme's stages are not a flaw to explain away but an accidental first traversal of the very ladder the re-attachment design (§7.9) would build deliberately.</w:t>
       </w:r>
     </w:p>
     <w:p>

</xml_diff>

<commit_message>
V37 s1.1: anchor departure story to verifiable citations; narrow author-input flags
- Korean home-market sentence now cites the system's Korean clinical
  research base (Park et al., 2019 community validation N=289, Seoul;
  Kim et al., 2018 reliability) - both already in the reference list -
  with the yellow flag narrowed to the comparative utilisation figures
  (InBody industry documentation)
- Gamified-mode sentence now cites the FRA line's shipped training
  mode of balance games (InBody Co., Ltd., 2022 catalogue, already
  referenced), with the yellow flag narrowed to the manufacturer's
  early-dropout experience (industry documentation or published
  account)
- Web verification: Park et al. 2019 (Ann Rehabil Med 43(1):87-95,
  doi 10.5535/arm.2019.43.1.87) contains no utilisation statistics -
  it cannot carry the utilisation-comparison claim alone

Co-Authored-By: Claude Fable 5 <noreply@anthropic.com>
Claude-Session: https://claude.ai/code/session_01KoT3i8geZspYBMMKVYJUTG
</commit_message>
<xml_diff>
--- a/docs/thesis/Full_version_V37_REVIEW_EngD_Thesis_Submission_Draft.docx
+++ b/docs/thesis/Full_version_V37_REVIEW_EngD_Thesis_Submission_Draft.docx
@@ -6742,22 +6742,35 @@
         <w:jc w:val="both"/>
       </w:pPr>
       <w:r>
+        <w:rPr/>
         <w:t xml:space="preserve">The station's own history sharpens the puzzle. The FRA had been installed roughly twelve years before this research began </w:t>
       </w:r>
       <w:r>
         <w:rPr>
           <w:highlight w:val="yellow"/>
         </w:rPr>
+      </w:r>
+      <w:r/>
+      <w:r>
+        <w:rPr>
+          <w:highlight w:val="yellow"/>
+        </w:rPr>
+      </w:r>
+      <w:r/>
+      <w:r>
+        <w:rPr>
+          <w:highlight w:val="yellow"/>
+        </w:rPr>
         <w:t>[AUTHOR INPUT NEEDED: exact installation year]</w:t>
       </w:r>
       <w:r>
-        <w:t xml:space="preserve">, and its decade of near-silence was not what its manufacturer had reason to expect: in InBody's Korean home market, the same platform family reportedly achieved substantially higher utilisation </w:t>
+        <w:t xml:space="preserve">, and its decade of near-silence was not what its manufacturer had reason to expect. In the platform's Korean home market the system was introduced with an active clinical research base - a community validation study of 289 older adults at a Seoul senior welfare centre (Park et al., 2019) and a reliability study (Kim et al., 2018) - and the author's industry experience was that home-market utilisation ran substantially higher than the silence observed in this hall </w:t>
       </w:r>
       <w:r>
         <w:rPr>
           <w:highlight w:val="yellow"/>
         </w:rPr>
-        <w:t>[AUTHOR INPUT NEEDED: citation for the Korean utilisation comparison]</w:t>
+        <w:t>[AUTHOR INPUT NEEDED: source for the comparative utilisation figures - InBody industry documentation]</w:t>
       </w:r>
       <w:r>
         <w:t>. Same instrument, same clinical purpose, different fate - the gap between the two markets is itself a datum, and the cross-cultural reference point is taken up in Chapter 4 (§4.7).</w:t>
@@ -6768,13 +6781,20 @@
         <w:jc w:val="both"/>
       </w:pPr>
       <w:r>
-        <w:t xml:space="preserve">The evaluation that became this thesis began in late 2023, when the author - an industrial practitioner responsible for exactly such equipment - started to examine the station's silence systematically. The first working direction came from the author's supervisor: gamification might help. The direction was credible on the evidence then available - the literature reviewed in Chapter 2 documents game-based engagement effects for older adults - and games were duly developed for the platform. Yet the industrial signal was already mixed: the manufacturer's own experience with gamified modes on the FRA line reportedly showed a similar pattern of early dropout </w:t>
+        <w:rPr/>
+        <w:t xml:space="preserve">The evaluation that became this thesis began in late 2023, when the author - an industrial practitioner responsible for exactly such equipment - started to examine the station's silence systematically. The first working direction came from the author's supervisor: gamification might help. The direction was credible on the evidence then available - the literature reviewed in Chapter 2 documents game-based engagement effects for older adults - and games were duly developed for the platform. Nor was the idea foreign to the manufacturer: the FRA line itself ships with a training mode of balance games tailored to test results (InBody Co., Ltd., 2022). Yet the industrial signal was already mixed: the manufacturer's own experience with these gamified modes reportedly showed a similar pattern of early dropout </w:t>
       </w:r>
       <w:r>
         <w:rPr>
           <w:highlight w:val="yellow"/>
         </w:rPr>
-        <w:t>[AUTHOR INPUT NEEDED: citation for InBody's gamified-FRA experience]</w:t>
+      </w:r>
+      <w:r/>
+      <w:r>
+        <w:rPr>
+          <w:highlight w:val="yellow"/>
+        </w:rPr>
+        <w:t>[AUTHOR INPUT NEEDED: InBody industry documentation or published account of the gamified-mode experience]</w:t>
       </w:r>
       <w:r>
         <w:t>. Adding a game, in other words, was known not to be a guaranteed cure before this programme deployed one - which is precisely what made the question worth asking properly. If the station is free, clinically beneficial, accessible and now fun, and people still leave after their first failure, then what, exactly, is doing the leaving? The working conjecture formed at this point - failure-induced dropout, stated as the pre-research hypothesis in §1.5 - and what became of it is reported stage by stage in the chapters that follow.</w:t>

</xml_diff>

<commit_message>
V37 s1.1: no Korea-China utilisation comparison claimed - assumption framing
Author decision: the published Korean record validates the instrument
(Park et al. 2019; Kim et al. 2018) but reports no uptake rates, so
s1.1 explicitly states that no utilisation comparison is made between
the two markets. The contrast is framed as an assumption worth
examining - that the station's silence reflects challenges local to
its deployment (operational, cultural, psychological) rather than a
defect of the instrument - examined from Chapter 4 onward. The
comparative-utilisation yellow flag is removed; remaining s1.1 flags:
exact installation year, InBody gamified-mode experience documentation.

Co-Authored-By: Claude Fable 5 <noreply@anthropic.com>
Claude-Session: https://claude.ai/code/session_01KoT3i8geZspYBMMKVYJUTG
</commit_message>
<xml_diff>
--- a/docs/thesis/Full_version_V37_REVIEW_EngD_Thesis_Submission_Draft.docx
+++ b/docs/thesis/Full_version_V37_REVIEW_EngD_Thesis_Submission_Draft.docx
@@ -6761,19 +6761,22 @@
         <w:rPr>
           <w:highlight w:val="yellow"/>
         </w:rPr>
+      </w:r>
+      <w:r/>
+      <w:r>
+        <w:rPr>
+          <w:highlight w:val="yellow"/>
+        </w:rPr>
+      </w:r>
+      <w:r/>
+      <w:r>
+        <w:rPr>
+          <w:highlight w:val="yellow"/>
+        </w:rPr>
         <w:t>[AUTHOR INPUT NEEDED: exact installation year]</w:t>
       </w:r>
       <w:r>
-        <w:t xml:space="preserve">, and its decade of near-silence was not what its manufacturer had reason to expect. In the platform's Korean home market the system was introduced with an active clinical research base - a community validation study of 289 older adults at a Seoul senior welfare centre (Park et al., 2019) and a reliability study (Kim et al., 2018) - and the author's industry experience was that home-market utilisation ran substantially higher than the silence observed in this hall </w:t>
-      </w:r>
-      <w:r>
-        <w:rPr>
-          <w:highlight w:val="yellow"/>
-        </w:rPr>
-        <w:t>[AUTHOR INPUT NEEDED: source for the comparative utilisation figures - InBody industry documentation]</w:t>
-      </w:r>
-      <w:r>
-        <w:t>. Same instrument, same clinical purpose, different fate - the gap between the two markets is itself a datum, and the cross-cultural reference point is taken up in Chapter 4 (§4.7).</w:t>
+        <w:t>, and its decade of near-silence sat oddly beside the platform's standing in its Korean home market, where the system was introduced with an active clinical research base - a community validation study of 289 older adults at a Seoul senior welfare centre (Park et al., 2019) and a reliability study (Kim et al., 2018). Whether home-market utilisation actually ran higher is not verifiable from the published record - the Korean literature validates the instrument but reports no uptake rates - and this thesis therefore makes no utilisation comparison between the two markets. What the contrast supplied instead was an assumption worth examining: that the station's silence reflected challenges local to its deployment - operational, cultural, or psychological - rather than a defect of the instrument itself. That assumption is examined from Chapter 4 onward, and the cross-cultural reference point is taken up at §4.7.</w:t>
       </w:r>
     </w:p>
     <w:p>

</xml_diff>